<commit_message>
Tải 12 tháng: mẫu và sản xuất chồng theo vòng mùa, ngày làm việc thực
Thêm lịch nghỉ thứ 7 TIVN-APIC 2026 (nhóm A/B) và lich_lam_viec.py (thứ 2–7,
nghỉ thứ 7 theo nhóm, trừ lễ; Tết 2027 tạm 4–12/2). ke-hoach-nam.py tính
11/2026 – 10/2027: sản xuất mùa đến 27SS theo Plantable, 27FW/28SS theo mùa
tương ứng năm trước; mẫu tồn + cùng tháng năm trước. Cập nhật tài liệu,
bàn giao và bản Word/Excel.

Co-Authored-By: Claude Opus 5.5 <noreply@anthropic.com>
Claude-Session: https://claude.ai/code/session_01GJjWaqKTGo1Zrw6K7RRJy3
</commit_message>
<xml_diff>
--- a/docs/tai-ve/Ban-giao-phan-tich-MD-APIC.docx
+++ b/docs/tai-ve/Ban-giao-phan-tich-MD-APIC.docx
@@ -94,7 +94,23 @@
         <w:t xml:space="preserve">Trạng thái</w:t>
       </w:r>
       <w:r>
-        <w:t xml:space="preserve">: đã có phân tích mùa vừa qua, tải theo tháng 11/2026 – 2/2027 từ Plantable và file mẫu thật, các quyết định phân công của quản lý, bản Word/Excel để tải về. Không còn việc dở dang; đang chờ dữ liệu mới (kế hoạch mẫu 1st 28SS, Plantable cập nhật).</w:t>
+        <w:t xml:space="preserve">: đã có phân tích mùa vừa qua,</w:t>
+      </w:r>
+      <w:r>
+        <w:t xml:space="preserve"> </w:t>
+      </w:r>
+      <w:r>
+        <w:rPr>
+          <w:bCs/>
+          <w:b/>
+        </w:rPr>
+        <w:t xml:space="preserve">tải theo tháng cả vòng 12 tháng 11/2026 – 10/2027</w:t>
+      </w:r>
+      <w:r>
+        <w:t xml:space="preserve"> </w:t>
+      </w:r>
+      <w:r>
+        <w:t xml:space="preserve">(mẫu và sản xuất của hai mùa chồng nhau, theo ngày làm việc thực), các quyết định phân công của quản lý, bản Word/Excel để tải về. Không còn việc dở dang; đang chờ dữ liệu mới (kế hoạch mẫu 1st 28SS, Plantable cập nhật).</w:t>
       </w:r>
     </w:p>
     <w:p>
@@ -1272,13 +1288,13 @@
       </w:tr>
     </w:tbl>
     <w:bookmarkEnd w:id="22"/>
-    <w:bookmarkStart w:id="23" w:name="X8ab836a64f4f6fe18d6b58e05c03bc5a88d00ca"/>
+    <w:bookmarkStart w:id="23" w:name="X18cfc3f36cc5b2140e6174c8ee6a7b5664cd361"/>
     <w:p>
       <w:pPr>
         <w:pStyle w:val="Heading2"/>
       </w:pPr>
       <w:r>
-        <w:t xml:space="preserve">4. Kết quả chính (tải theo tháng, theo các quyết định đã chốt)</w:t>
+        <w:t xml:space="preserve">4. Kết quả chính (tải 12 tháng, theo các quyết định đã chốt)</w:t>
       </w:r>
     </w:p>
     <w:p>
@@ -1286,7 +1302,7 @@
         <w:pStyle w:val="FirstParagraph"/>
       </w:pPr>
       <w:r>
-        <w:t xml:space="preserve">1,0 = khối lượng trung bình 1 người/1 tháng trong giai đoạn 11/2026 – 2/2027. ≥ 1,4 = vượt mức tăng ca 1 giờ/ngày.</w:t>
+        <w:t xml:space="preserve">1,0 = khối lượng trung bình cho 1 ngày công trong cả 12 tháng; ≥ 1,4 = vượt mức tăng ca 1 giờ/ngày. Từ 4/2027 là số ước theo cùng kỳ năm trước.</w:t>
       </w:r>
     </w:p>
     <w:tbl>
@@ -1514,97 +1530,97 @@
               <w:rPr>
                 <w:sz w:val="18"/>
               </w:rPr>
-              <w:t xml:space="preserve">1,71</w:t>
-            </w:r>
-          </w:p>
-        </w:tc>
-        <w:tc>
-          <w:tcPr>
-            <w:tcW w:type="dxa" w:w="1715"/>
-          </w:tcPr>
-          <w:p>
-            <w:pPr>
-              <w:pStyle w:val="Compact"/>
-              <w:spacing w:after="20" w:before="20"/>
-              <w:jc w:val="left"/>
-            </w:pPr>
-            <w:r>
-              <w:rPr>
-                <w:sz w:val="18"/>
-              </w:rPr>
-              <w:t xml:space="preserve">1,30</w:t>
-            </w:r>
-          </w:p>
-        </w:tc>
-        <w:tc>
-          <w:tcPr>
-            <w:tcW w:type="dxa" w:w="1715"/>
-          </w:tcPr>
-          <w:p>
-            <w:pPr>
-              <w:pStyle w:val="Compact"/>
-              <w:spacing w:after="20" w:before="20"/>
-              <w:jc w:val="left"/>
-            </w:pPr>
-            <w:r>
-              <w:rPr>
-                <w:sz w:val="18"/>
-              </w:rPr>
-              <w:t xml:space="preserve">0,78</w:t>
-            </w:r>
-          </w:p>
-        </w:tc>
-        <w:tc>
-          <w:tcPr>
-            <w:tcW w:type="dxa" w:w="1715"/>
-          </w:tcPr>
-          <w:p>
-            <w:pPr>
-              <w:pStyle w:val="Compact"/>
-              <w:spacing w:after="20" w:before="20"/>
-              <w:jc w:val="left"/>
-            </w:pPr>
-            <w:r>
-              <w:rPr>
-                <w:sz w:val="18"/>
-              </w:rPr>
-              <w:t xml:space="preserve">1,42</w:t>
-            </w:r>
-          </w:p>
-        </w:tc>
-        <w:tc>
-          <w:tcPr>
-            <w:tcW w:type="dxa" w:w="1715"/>
-          </w:tcPr>
-          <w:p>
-            <w:pPr>
-              <w:pStyle w:val="Compact"/>
-              <w:spacing w:after="20" w:before="20"/>
-              <w:jc w:val="left"/>
-            </w:pPr>
-            <w:r>
-              <w:rPr>
-                <w:sz w:val="18"/>
-              </w:rPr>
-              <w:t xml:space="preserve">1,65</w:t>
-            </w:r>
-          </w:p>
-        </w:tc>
-        <w:tc>
-          <w:tcPr>
-            <w:tcW w:type="dxa" w:w="1715"/>
-          </w:tcPr>
-          <w:p>
-            <w:pPr>
-              <w:pStyle w:val="Compact"/>
-              <w:spacing w:after="20" w:before="20"/>
-              <w:jc w:val="left"/>
-            </w:pPr>
-            <w:r>
-              <w:rPr>
-                <w:sz w:val="18"/>
-              </w:rPr>
-              <w:t xml:space="preserve">1,48</w:t>
+              <w:t xml:space="preserve">1,66</w:t>
+            </w:r>
+          </w:p>
+        </w:tc>
+        <w:tc>
+          <w:tcPr>
+            <w:tcW w:type="dxa" w:w="1715"/>
+          </w:tcPr>
+          <w:p>
+            <w:pPr>
+              <w:pStyle w:val="Compact"/>
+              <w:spacing w:after="20" w:before="20"/>
+              <w:jc w:val="left"/>
+            </w:pPr>
+            <w:r>
+              <w:rPr>
+                <w:sz w:val="18"/>
+              </w:rPr>
+              <w:t xml:space="preserve">1,81</w:t>
+            </w:r>
+          </w:p>
+        </w:tc>
+        <w:tc>
+          <w:tcPr>
+            <w:tcW w:type="dxa" w:w="1715"/>
+          </w:tcPr>
+          <w:p>
+            <w:pPr>
+              <w:pStyle w:val="Compact"/>
+              <w:spacing w:after="20" w:before="20"/>
+              <w:jc w:val="left"/>
+            </w:pPr>
+            <w:r>
+              <w:rPr>
+                <w:sz w:val="18"/>
+              </w:rPr>
+              <w:t xml:space="preserve">0,94</w:t>
+            </w:r>
+          </w:p>
+        </w:tc>
+        <w:tc>
+          <w:tcPr>
+            <w:tcW w:type="dxa" w:w="1715"/>
+          </w:tcPr>
+          <w:p>
+            <w:pPr>
+              <w:pStyle w:val="Compact"/>
+              <w:spacing w:after="20" w:before="20"/>
+              <w:jc w:val="left"/>
+            </w:pPr>
+            <w:r>
+              <w:rPr>
+                <w:sz w:val="18"/>
+              </w:rPr>
+              <w:t xml:space="preserve">1,36</w:t>
+            </w:r>
+          </w:p>
+        </w:tc>
+        <w:tc>
+          <w:tcPr>
+            <w:tcW w:type="dxa" w:w="1715"/>
+          </w:tcPr>
+          <w:p>
+            <w:pPr>
+              <w:pStyle w:val="Compact"/>
+              <w:spacing w:after="20" w:before="20"/>
+              <w:jc w:val="left"/>
+            </w:pPr>
+            <w:r>
+              <w:rPr>
+                <w:sz w:val="18"/>
+              </w:rPr>
+              <w:t xml:space="preserve">1,63</w:t>
+            </w:r>
+          </w:p>
+        </w:tc>
+        <w:tc>
+          <w:tcPr>
+            <w:tcW w:type="dxa" w:w="1715"/>
+          </w:tcPr>
+          <w:p>
+            <w:pPr>
+              <w:pStyle w:val="Compact"/>
+              <w:spacing w:after="20" w:before="20"/>
+              <w:jc w:val="left"/>
+            </w:pPr>
+            <w:r>
+              <w:rPr>
+                <w:sz w:val="18"/>
+              </w:rPr>
+              <w:t xml:space="preserve">1,41</w:t>
             </w:r>
           </w:p>
         </w:tc>
@@ -1622,7 +1638,7 @@
               <w:rPr>
                 <w:sz w:val="18"/>
               </w:rPr>
-              <w:t xml:space="preserve">1,05</w:t>
+              <w:t xml:space="preserve">1,09</w:t>
             </w:r>
           </w:p>
         </w:tc>
@@ -1660,97 +1676,97 @@
               <w:rPr>
                 <w:sz w:val="18"/>
               </w:rPr>
-              <w:t xml:space="preserve">2,21</w:t>
-            </w:r>
-          </w:p>
-        </w:tc>
-        <w:tc>
-          <w:tcPr>
-            <w:tcW w:type="dxa" w:w="1715"/>
-          </w:tcPr>
-          <w:p>
-            <w:pPr>
-              <w:pStyle w:val="Compact"/>
-              <w:spacing w:after="20" w:before="20"/>
-              <w:jc w:val="left"/>
-            </w:pPr>
-            <w:r>
-              <w:rPr>
-                <w:sz w:val="18"/>
-              </w:rPr>
-              <w:t xml:space="preserve">1,46</w:t>
-            </w:r>
-          </w:p>
-        </w:tc>
-        <w:tc>
-          <w:tcPr>
-            <w:tcW w:type="dxa" w:w="1715"/>
-          </w:tcPr>
-          <w:p>
-            <w:pPr>
-              <w:pStyle w:val="Compact"/>
-              <w:spacing w:after="20" w:before="20"/>
-              <w:jc w:val="left"/>
-            </w:pPr>
-            <w:r>
-              <w:rPr>
-                <w:sz w:val="18"/>
-              </w:rPr>
-              <w:t xml:space="preserve">1,25</w:t>
-            </w:r>
-          </w:p>
-        </w:tc>
-        <w:tc>
-          <w:tcPr>
-            <w:tcW w:type="dxa" w:w="1715"/>
-          </w:tcPr>
-          <w:p>
-            <w:pPr>
-              <w:pStyle w:val="Compact"/>
-              <w:spacing w:after="20" w:before="20"/>
-              <w:jc w:val="left"/>
-            </w:pPr>
-            <w:r>
-              <w:rPr>
-                <w:sz w:val="18"/>
-              </w:rPr>
-              <w:t xml:space="preserve">0,89</w:t>
-            </w:r>
-          </w:p>
-        </w:tc>
-        <w:tc>
-          <w:tcPr>
-            <w:tcW w:type="dxa" w:w="1715"/>
-          </w:tcPr>
-          <w:p>
-            <w:pPr>
-              <w:pStyle w:val="Compact"/>
-              <w:spacing w:after="20" w:before="20"/>
-              <w:jc w:val="left"/>
-            </w:pPr>
-            <w:r>
-              <w:rPr>
-                <w:sz w:val="18"/>
-              </w:rPr>
-              <w:t xml:space="preserve">0,45</w:t>
-            </w:r>
-          </w:p>
-        </w:tc>
-        <w:tc>
-          <w:tcPr>
-            <w:tcW w:type="dxa" w:w="1715"/>
-          </w:tcPr>
-          <w:p>
-            <w:pPr>
-              <w:pStyle w:val="Compact"/>
-              <w:spacing w:after="20" w:before="20"/>
-              <w:jc w:val="left"/>
-            </w:pPr>
-            <w:r>
-              <w:rPr>
-                <w:sz w:val="18"/>
-              </w:rPr>
-              <w:t xml:space="preserve">1,50</w:t>
+              <w:t xml:space="preserve">1,95</w:t>
+            </w:r>
+          </w:p>
+        </w:tc>
+        <w:tc>
+          <w:tcPr>
+            <w:tcW w:type="dxa" w:w="1715"/>
+          </w:tcPr>
+          <w:p>
+            <w:pPr>
+              <w:pStyle w:val="Compact"/>
+              <w:spacing w:after="20" w:before="20"/>
+              <w:jc w:val="left"/>
+            </w:pPr>
+            <w:r>
+              <w:rPr>
+                <w:sz w:val="18"/>
+              </w:rPr>
+              <w:t xml:space="preserve">1,54</w:t>
+            </w:r>
+          </w:p>
+        </w:tc>
+        <w:tc>
+          <w:tcPr>
+            <w:tcW w:type="dxa" w:w="1715"/>
+          </w:tcPr>
+          <w:p>
+            <w:pPr>
+              <w:pStyle w:val="Compact"/>
+              <w:spacing w:after="20" w:before="20"/>
+              <w:jc w:val="left"/>
+            </w:pPr>
+            <w:r>
+              <w:rPr>
+                <w:sz w:val="18"/>
+              </w:rPr>
+              <w:t xml:space="preserve">1,22</w:t>
+            </w:r>
+          </w:p>
+        </w:tc>
+        <w:tc>
+          <w:tcPr>
+            <w:tcW w:type="dxa" w:w="1715"/>
+          </w:tcPr>
+          <w:p>
+            <w:pPr>
+              <w:pStyle w:val="Compact"/>
+              <w:spacing w:after="20" w:before="20"/>
+              <w:jc w:val="left"/>
+            </w:pPr>
+            <w:r>
+              <w:rPr>
+                <w:sz w:val="18"/>
+              </w:rPr>
+              <w:t xml:space="preserve">0,55</w:t>
+            </w:r>
+          </w:p>
+        </w:tc>
+        <w:tc>
+          <w:tcPr>
+            <w:tcW w:type="dxa" w:w="1715"/>
+          </w:tcPr>
+          <w:p>
+            <w:pPr>
+              <w:pStyle w:val="Compact"/>
+              <w:spacing w:after="20" w:before="20"/>
+              <w:jc w:val="left"/>
+            </w:pPr>
+            <w:r>
+              <w:rPr>
+                <w:sz w:val="18"/>
+              </w:rPr>
+              <w:t xml:space="preserve">0,41</w:t>
+            </w:r>
+          </w:p>
+        </w:tc>
+        <w:tc>
+          <w:tcPr>
+            <w:tcW w:type="dxa" w:w="1715"/>
+          </w:tcPr>
+          <w:p>
+            <w:pPr>
+              <w:pStyle w:val="Compact"/>
+              <w:spacing w:after="20" w:before="20"/>
+              <w:jc w:val="left"/>
+            </w:pPr>
+            <w:r>
+              <w:rPr>
+                <w:sz w:val="18"/>
+              </w:rPr>
+              <w:t xml:space="preserve">1,32</w:t>
             </w:r>
           </w:p>
         </w:tc>
@@ -1768,7 +1784,7 @@
               <w:rPr>
                 <w:sz w:val="18"/>
               </w:rPr>
-              <w:t xml:space="preserve">0,35</w:t>
+              <w:t xml:space="preserve">0,31</w:t>
             </w:r>
           </w:p>
         </w:tc>
@@ -1806,97 +1822,97 @@
               <w:rPr>
                 <w:sz w:val="18"/>
               </w:rPr>
-              <w:t xml:space="preserve">1,32</w:t>
-            </w:r>
-          </w:p>
-        </w:tc>
-        <w:tc>
-          <w:tcPr>
-            <w:tcW w:type="dxa" w:w="1715"/>
-          </w:tcPr>
-          <w:p>
-            <w:pPr>
-              <w:pStyle w:val="Compact"/>
-              <w:spacing w:after="20" w:before="20"/>
-              <w:jc w:val="left"/>
-            </w:pPr>
-            <w:r>
-              <w:rPr>
-                <w:sz w:val="18"/>
-              </w:rPr>
-              <w:t xml:space="preserve">1,27</w:t>
-            </w:r>
-          </w:p>
-        </w:tc>
-        <w:tc>
-          <w:tcPr>
-            <w:tcW w:type="dxa" w:w="1715"/>
-          </w:tcPr>
-          <w:p>
-            <w:pPr>
-              <w:pStyle w:val="Compact"/>
-              <w:spacing w:after="20" w:before="20"/>
-              <w:jc w:val="left"/>
-            </w:pPr>
-            <w:r>
-              <w:rPr>
-                <w:sz w:val="18"/>
-              </w:rPr>
-              <w:t xml:space="preserve">0,81</w:t>
-            </w:r>
-          </w:p>
-        </w:tc>
-        <w:tc>
-          <w:tcPr>
-            <w:tcW w:type="dxa" w:w="1715"/>
-          </w:tcPr>
-          <w:p>
-            <w:pPr>
-              <w:pStyle w:val="Compact"/>
-              <w:spacing w:after="20" w:before="20"/>
-              <w:jc w:val="left"/>
-            </w:pPr>
-            <w:r>
-              <w:rPr>
-                <w:sz w:val="18"/>
-              </w:rPr>
-              <w:t xml:space="preserve">0,15</w:t>
-            </w:r>
-          </w:p>
-        </w:tc>
-        <w:tc>
-          <w:tcPr>
-            <w:tcW w:type="dxa" w:w="1715"/>
-          </w:tcPr>
-          <w:p>
-            <w:pPr>
-              <w:pStyle w:val="Compact"/>
-              <w:spacing w:after="20" w:before="20"/>
-              <w:jc w:val="left"/>
-            </w:pPr>
-            <w:r>
-              <w:rPr>
-                <w:sz w:val="18"/>
-              </w:rPr>
-              <w:t xml:space="preserve">1,61</w:t>
-            </w:r>
-          </w:p>
-        </w:tc>
-        <w:tc>
-          <w:tcPr>
-            <w:tcW w:type="dxa" w:w="1715"/>
-          </w:tcPr>
-          <w:p>
-            <w:pPr>
-              <w:pStyle w:val="Compact"/>
-              <w:spacing w:after="20" w:before="20"/>
-              <w:jc w:val="left"/>
-            </w:pPr>
-            <w:r>
-              <w:rPr>
-                <w:sz w:val="18"/>
-              </w:rPr>
-              <w:t xml:space="preserve">0,89</w:t>
+              <w:t xml:space="preserve">1,38</w:t>
+            </w:r>
+          </w:p>
+        </w:tc>
+        <w:tc>
+          <w:tcPr>
+            <w:tcW w:type="dxa" w:w="1715"/>
+          </w:tcPr>
+          <w:p>
+            <w:pPr>
+              <w:pStyle w:val="Compact"/>
+              <w:spacing w:after="20" w:before="20"/>
+              <w:jc w:val="left"/>
+            </w:pPr>
+            <w:r>
+              <w:rPr>
+                <w:sz w:val="18"/>
+              </w:rPr>
+              <w:t xml:space="preserve">1,30</w:t>
+            </w:r>
+          </w:p>
+        </w:tc>
+        <w:tc>
+          <w:tcPr>
+            <w:tcW w:type="dxa" w:w="1715"/>
+          </w:tcPr>
+          <w:p>
+            <w:pPr>
+              <w:pStyle w:val="Compact"/>
+              <w:spacing w:after="20" w:before="20"/>
+              <w:jc w:val="left"/>
+            </w:pPr>
+            <w:r>
+              <w:rPr>
+                <w:sz w:val="18"/>
+              </w:rPr>
+              <w:t xml:space="preserve">0,88</w:t>
+            </w:r>
+          </w:p>
+        </w:tc>
+        <w:tc>
+          <w:tcPr>
+            <w:tcW w:type="dxa" w:w="1715"/>
+          </w:tcPr>
+          <w:p>
+            <w:pPr>
+              <w:pStyle w:val="Compact"/>
+              <w:spacing w:after="20" w:before="20"/>
+              <w:jc w:val="left"/>
+            </w:pPr>
+            <w:r>
+              <w:rPr>
+                <w:sz w:val="18"/>
+              </w:rPr>
+              <w:t xml:space="preserve">0,16</w:t>
+            </w:r>
+          </w:p>
+        </w:tc>
+        <w:tc>
+          <w:tcPr>
+            <w:tcW w:type="dxa" w:w="1715"/>
+          </w:tcPr>
+          <w:p>
+            <w:pPr>
+              <w:pStyle w:val="Compact"/>
+              <w:spacing w:after="20" w:before="20"/>
+              <w:jc w:val="left"/>
+            </w:pPr>
+            <w:r>
+              <w:rPr>
+                <w:sz w:val="18"/>
+              </w:rPr>
+              <w:t xml:space="preserve">1,57</w:t>
+            </w:r>
+          </w:p>
+        </w:tc>
+        <w:tc>
+          <w:tcPr>
+            <w:tcW w:type="dxa" w:w="1715"/>
+          </w:tcPr>
+          <w:p>
+            <w:pPr>
+              <w:pStyle w:val="Compact"/>
+              <w:spacing w:after="20" w:before="20"/>
+              <w:jc w:val="left"/>
+            </w:pPr>
+            <w:r>
+              <w:rPr>
+                <w:sz w:val="18"/>
+              </w:rPr>
+              <w:t xml:space="preserve">0,87</w:t>
             </w:r>
           </w:p>
         </w:tc>
@@ -1914,7 +1930,7 @@
               <w:rPr>
                 <w:sz w:val="18"/>
               </w:rPr>
-              <w:t xml:space="preserve">1,17</w:t>
+              <w:t xml:space="preserve">1,21</w:t>
             </w:r>
           </w:p>
         </w:tc>
@@ -1952,6 +1968,662 @@
               <w:rPr>
                 <w:sz w:val="18"/>
               </w:rPr>
+              <w:t xml:space="preserve">1,93</w:t>
+            </w:r>
+          </w:p>
+        </w:tc>
+        <w:tc>
+          <w:tcPr>
+            <w:tcW w:type="dxa" w:w="1715"/>
+          </w:tcPr>
+          <w:p>
+            <w:pPr>
+              <w:pStyle w:val="Compact"/>
+              <w:spacing w:after="20" w:before="20"/>
+              <w:jc w:val="left"/>
+            </w:pPr>
+            <w:r>
+              <w:rPr>
+                <w:sz w:val="18"/>
+              </w:rPr>
+              <w:t xml:space="preserve">0,91</w:t>
+            </w:r>
+          </w:p>
+        </w:tc>
+        <w:tc>
+          <w:tcPr>
+            <w:tcW w:type="dxa" w:w="1715"/>
+          </w:tcPr>
+          <w:p>
+            <w:pPr>
+              <w:pStyle w:val="Compact"/>
+              <w:spacing w:after="20" w:before="20"/>
+              <w:jc w:val="left"/>
+            </w:pPr>
+            <w:r>
+              <w:rPr>
+                <w:sz w:val="18"/>
+              </w:rPr>
+              <w:t xml:space="preserve">0,99</w:t>
+            </w:r>
+          </w:p>
+        </w:tc>
+        <w:tc>
+          <w:tcPr>
+            <w:tcW w:type="dxa" w:w="1715"/>
+          </w:tcPr>
+          <w:p>
+            <w:pPr>
+              <w:pStyle w:val="Compact"/>
+              <w:spacing w:after="20" w:before="20"/>
+              <w:jc w:val="left"/>
+            </w:pPr>
+            <w:r>
+              <w:rPr>
+                <w:sz w:val="18"/>
+              </w:rPr>
+              <w:t xml:space="preserve">0,17</w:t>
+            </w:r>
+          </w:p>
+        </w:tc>
+        <w:tc>
+          <w:tcPr>
+            <w:tcW w:type="dxa" w:w="1715"/>
+          </w:tcPr>
+          <w:p>
+            <w:pPr>
+              <w:pStyle w:val="Compact"/>
+              <w:spacing w:after="20" w:before="20"/>
+              <w:jc w:val="left"/>
+            </w:pPr>
+            <w:r>
+              <w:rPr>
+                <w:sz w:val="18"/>
+              </w:rPr>
+              <w:t xml:space="preserve">0,70</w:t>
+            </w:r>
+          </w:p>
+        </w:tc>
+        <w:tc>
+          <w:tcPr>
+            <w:tcW w:type="dxa" w:w="1715"/>
+          </w:tcPr>
+          <w:p>
+            <w:pPr>
+              <w:pStyle w:val="Compact"/>
+              <w:spacing w:after="20" w:before="20"/>
+              <w:jc w:val="left"/>
+            </w:pPr>
+            <w:r>
+              <w:rPr>
+                <w:sz w:val="18"/>
+              </w:rPr>
+              <w:t xml:space="preserve">0,88</w:t>
+            </w:r>
+          </w:p>
+        </w:tc>
+        <w:tc>
+          <w:tcPr>
+            <w:tcW w:type="dxa" w:w="2788"/>
+          </w:tcPr>
+          <w:p>
+            <w:pPr>
+              <w:pStyle w:val="Compact"/>
+              <w:spacing w:after="20" w:before="20"/>
+              <w:jc w:val="left"/>
+            </w:pPr>
+            <w:r>
+              <w:rPr>
+                <w:sz w:val="18"/>
+              </w:rPr>
+              <w:t xml:space="preserve">1,22</w:t>
+            </w:r>
+          </w:p>
+        </w:tc>
+      </w:tr>
+      <w:tr>
+        <w:tc>
+          <w:tcPr>
+            <w:tcW w:type="dxa" w:w="1715"/>
+          </w:tcPr>
+          <w:p>
+            <w:pPr>
+              <w:pStyle w:val="Compact"/>
+              <w:spacing w:after="20" w:before="20"/>
+              <w:jc w:val="left"/>
+            </w:pPr>
+            <w:r>
+              <w:rPr>
+                <w:sz w:val="18"/>
+              </w:rPr>
+              <w:t xml:space="preserve">3/2027</w:t>
+            </w:r>
+          </w:p>
+        </w:tc>
+        <w:tc>
+          <w:tcPr>
+            <w:tcW w:type="dxa" w:w="1715"/>
+          </w:tcPr>
+          <w:p>
+            <w:pPr>
+              <w:pStyle w:val="Compact"/>
+              <w:spacing w:after="20" w:before="20"/>
+              <w:jc w:val="left"/>
+            </w:pPr>
+            <w:r>
+              <w:rPr>
+                <w:sz w:val="18"/>
+              </w:rPr>
+              <w:t xml:space="preserve">0,81</w:t>
+            </w:r>
+          </w:p>
+        </w:tc>
+        <w:tc>
+          <w:tcPr>
+            <w:tcW w:type="dxa" w:w="1715"/>
+          </w:tcPr>
+          <w:p>
+            <w:pPr>
+              <w:pStyle w:val="Compact"/>
+              <w:spacing w:after="20" w:before="20"/>
+              <w:jc w:val="left"/>
+            </w:pPr>
+            <w:r>
+              <w:rPr>
+                <w:sz w:val="18"/>
+              </w:rPr>
+              <w:t xml:space="preserve">1,30</w:t>
+            </w:r>
+          </w:p>
+        </w:tc>
+        <w:tc>
+          <w:tcPr>
+            <w:tcW w:type="dxa" w:w="1715"/>
+          </w:tcPr>
+          <w:p>
+            <w:pPr>
+              <w:pStyle w:val="Compact"/>
+              <w:spacing w:after="20" w:before="20"/>
+              <w:jc w:val="left"/>
+            </w:pPr>
+            <w:r>
+              <w:rPr>
+                <w:sz w:val="18"/>
+              </w:rPr>
+              <w:t xml:space="preserve">0,93</w:t>
+            </w:r>
+          </w:p>
+        </w:tc>
+        <w:tc>
+          <w:tcPr>
+            <w:tcW w:type="dxa" w:w="1715"/>
+          </w:tcPr>
+          <w:p>
+            <w:pPr>
+              <w:pStyle w:val="Compact"/>
+              <w:spacing w:after="20" w:before="20"/>
+              <w:jc w:val="left"/>
+            </w:pPr>
+            <w:r>
+              <w:rPr>
+                <w:sz w:val="18"/>
+              </w:rPr>
+              <w:t xml:space="preserve">0,10</w:t>
+            </w:r>
+          </w:p>
+        </w:tc>
+        <w:tc>
+          <w:tcPr>
+            <w:tcW w:type="dxa" w:w="1715"/>
+          </w:tcPr>
+          <w:p>
+            <w:pPr>
+              <w:pStyle w:val="Compact"/>
+              <w:spacing w:after="20" w:before="20"/>
+              <w:jc w:val="left"/>
+            </w:pPr>
+            <w:r>
+              <w:rPr>
+                <w:sz w:val="18"/>
+              </w:rPr>
+              <w:t xml:space="preserve">0,43</w:t>
+            </w:r>
+          </w:p>
+        </w:tc>
+        <w:tc>
+          <w:tcPr>
+            <w:tcW w:type="dxa" w:w="1715"/>
+          </w:tcPr>
+          <w:p>
+            <w:pPr>
+              <w:pStyle w:val="Compact"/>
+              <w:spacing w:after="20" w:before="20"/>
+              <w:jc w:val="left"/>
+            </w:pPr>
+            <w:r>
+              <w:rPr>
+                <w:sz w:val="18"/>
+              </w:rPr>
+              <w:t xml:space="preserve">0,60</w:t>
+            </w:r>
+          </w:p>
+        </w:tc>
+        <w:tc>
+          <w:tcPr>
+            <w:tcW w:type="dxa" w:w="2788"/>
+          </w:tcPr>
+          <w:p>
+            <w:pPr>
+              <w:pStyle w:val="Compact"/>
+              <w:spacing w:after="20" w:before="20"/>
+              <w:jc w:val="left"/>
+            </w:pPr>
+            <w:r>
+              <w:rPr>
+                <w:sz w:val="18"/>
+              </w:rPr>
+              <w:t xml:space="preserve">1,13</w:t>
+            </w:r>
+          </w:p>
+        </w:tc>
+      </w:tr>
+      <w:tr>
+        <w:tc>
+          <w:tcPr>
+            <w:tcW w:type="dxa" w:w="1715"/>
+          </w:tcPr>
+          <w:p>
+            <w:pPr>
+              <w:pStyle w:val="Compact"/>
+              <w:spacing w:after="20" w:before="20"/>
+              <w:jc w:val="left"/>
+            </w:pPr>
+            <w:r>
+              <w:rPr>
+                <w:sz w:val="18"/>
+              </w:rPr>
+              <w:t xml:space="preserve">4/2027</w:t>
+            </w:r>
+          </w:p>
+        </w:tc>
+        <w:tc>
+          <w:tcPr>
+            <w:tcW w:type="dxa" w:w="1715"/>
+          </w:tcPr>
+          <w:p>
+            <w:pPr>
+              <w:pStyle w:val="Compact"/>
+              <w:spacing w:after="20" w:before="20"/>
+              <w:jc w:val="left"/>
+            </w:pPr>
+            <w:r>
+              <w:rPr>
+                <w:sz w:val="18"/>
+              </w:rPr>
+              <w:t xml:space="preserve">0,96</w:t>
+            </w:r>
+          </w:p>
+        </w:tc>
+        <w:tc>
+          <w:tcPr>
+            <w:tcW w:type="dxa" w:w="1715"/>
+          </w:tcPr>
+          <w:p>
+            <w:pPr>
+              <w:pStyle w:val="Compact"/>
+              <w:spacing w:after="20" w:before="20"/>
+              <w:jc w:val="left"/>
+            </w:pPr>
+            <w:r>
+              <w:rPr>
+                <w:sz w:val="18"/>
+              </w:rPr>
+              <w:t xml:space="preserve">1,69</w:t>
+            </w:r>
+          </w:p>
+        </w:tc>
+        <w:tc>
+          <w:tcPr>
+            <w:tcW w:type="dxa" w:w="1715"/>
+          </w:tcPr>
+          <w:p>
+            <w:pPr>
+              <w:pStyle w:val="Compact"/>
+              <w:spacing w:after="20" w:before="20"/>
+              <w:jc w:val="left"/>
+            </w:pPr>
+            <w:r>
+              <w:rPr>
+                <w:sz w:val="18"/>
+              </w:rPr>
+              <w:t xml:space="preserve">1,12</w:t>
+            </w:r>
+          </w:p>
+        </w:tc>
+        <w:tc>
+          <w:tcPr>
+            <w:tcW w:type="dxa" w:w="1715"/>
+          </w:tcPr>
+          <w:p>
+            <w:pPr>
+              <w:pStyle w:val="Compact"/>
+              <w:spacing w:after="20" w:before="20"/>
+              <w:jc w:val="left"/>
+            </w:pPr>
+            <w:r>
+              <w:rPr>
+                <w:sz w:val="18"/>
+              </w:rPr>
+              <w:t xml:space="preserve">0,42</w:t>
+            </w:r>
+          </w:p>
+        </w:tc>
+        <w:tc>
+          <w:tcPr>
+            <w:tcW w:type="dxa" w:w="1715"/>
+          </w:tcPr>
+          <w:p>
+            <w:pPr>
+              <w:pStyle w:val="Compact"/>
+              <w:spacing w:after="20" w:before="20"/>
+              <w:jc w:val="left"/>
+            </w:pPr>
+            <w:r>
+              <w:rPr>
+                <w:sz w:val="18"/>
+              </w:rPr>
+              <w:t xml:space="preserve">1,03</w:t>
+            </w:r>
+          </w:p>
+        </w:tc>
+        <w:tc>
+          <w:tcPr>
+            <w:tcW w:type="dxa" w:w="1715"/>
+          </w:tcPr>
+          <w:p>
+            <w:pPr>
+              <w:pStyle w:val="Compact"/>
+              <w:spacing w:after="20" w:before="20"/>
+              <w:jc w:val="left"/>
+            </w:pPr>
+            <w:r>
+              <w:rPr>
+                <w:sz w:val="18"/>
+              </w:rPr>
+              <w:t xml:space="preserve">0,55</w:t>
+            </w:r>
+          </w:p>
+        </w:tc>
+        <w:tc>
+          <w:tcPr>
+            <w:tcW w:type="dxa" w:w="2788"/>
+          </w:tcPr>
+          <w:p>
+            <w:pPr>
+              <w:pStyle w:val="Compact"/>
+              <w:spacing w:after="20" w:before="20"/>
+              <w:jc w:val="left"/>
+            </w:pPr>
+            <w:r>
+              <w:rPr>
+                <w:sz w:val="18"/>
+              </w:rPr>
+              <w:t xml:space="preserve">2,57</w:t>
+            </w:r>
+          </w:p>
+        </w:tc>
+      </w:tr>
+      <w:tr>
+        <w:tc>
+          <w:tcPr>
+            <w:tcW w:type="dxa" w:w="1715"/>
+          </w:tcPr>
+          <w:p>
+            <w:pPr>
+              <w:pStyle w:val="Compact"/>
+              <w:spacing w:after="20" w:before="20"/>
+              <w:jc w:val="left"/>
+            </w:pPr>
+            <w:r>
+              <w:rPr>
+                <w:sz w:val="18"/>
+              </w:rPr>
+              <w:t xml:space="preserve">5/2027</w:t>
+            </w:r>
+          </w:p>
+        </w:tc>
+        <w:tc>
+          <w:tcPr>
+            <w:tcW w:type="dxa" w:w="1715"/>
+          </w:tcPr>
+          <w:p>
+            <w:pPr>
+              <w:pStyle w:val="Compact"/>
+              <w:spacing w:after="20" w:before="20"/>
+              <w:jc w:val="left"/>
+            </w:pPr>
+            <w:r>
+              <w:rPr>
+                <w:sz w:val="18"/>
+              </w:rPr>
+              <w:t xml:space="preserve">0,86</w:t>
+            </w:r>
+          </w:p>
+        </w:tc>
+        <w:tc>
+          <w:tcPr>
+            <w:tcW w:type="dxa" w:w="1715"/>
+          </w:tcPr>
+          <w:p>
+            <w:pPr>
+              <w:pStyle w:val="Compact"/>
+              <w:spacing w:after="20" w:before="20"/>
+              <w:jc w:val="left"/>
+            </w:pPr>
+            <w:r>
+              <w:rPr>
+                <w:sz w:val="18"/>
+              </w:rPr>
+              <w:t xml:space="preserve">1,53</w:t>
+            </w:r>
+          </w:p>
+        </w:tc>
+        <w:tc>
+          <w:tcPr>
+            <w:tcW w:type="dxa" w:w="1715"/>
+          </w:tcPr>
+          <w:p>
+            <w:pPr>
+              <w:pStyle w:val="Compact"/>
+              <w:spacing w:after="20" w:before="20"/>
+              <w:jc w:val="left"/>
+            </w:pPr>
+            <w:r>
+              <w:rPr>
+                <w:sz w:val="18"/>
+              </w:rPr>
+              <w:t xml:space="preserve">1,04</w:t>
+            </w:r>
+          </w:p>
+        </w:tc>
+        <w:tc>
+          <w:tcPr>
+            <w:tcW w:type="dxa" w:w="1715"/>
+          </w:tcPr>
+          <w:p>
+            <w:pPr>
+              <w:pStyle w:val="Compact"/>
+              <w:spacing w:after="20" w:before="20"/>
+              <w:jc w:val="left"/>
+            </w:pPr>
+            <w:r>
+              <w:rPr>
+                <w:sz w:val="18"/>
+              </w:rPr>
+              <w:t xml:space="preserve">0,40</w:t>
+            </w:r>
+          </w:p>
+        </w:tc>
+        <w:tc>
+          <w:tcPr>
+            <w:tcW w:type="dxa" w:w="1715"/>
+          </w:tcPr>
+          <w:p>
+            <w:pPr>
+              <w:pStyle w:val="Compact"/>
+              <w:spacing w:after="20" w:before="20"/>
+              <w:jc w:val="left"/>
+            </w:pPr>
+            <w:r>
+              <w:rPr>
+                <w:sz w:val="18"/>
+              </w:rPr>
+              <w:t xml:space="preserve">1,70</w:t>
+            </w:r>
+          </w:p>
+        </w:tc>
+        <w:tc>
+          <w:tcPr>
+            <w:tcW w:type="dxa" w:w="1715"/>
+          </w:tcPr>
+          <w:p>
+            <w:pPr>
+              <w:pStyle w:val="Compact"/>
+              <w:spacing w:after="20" w:before="20"/>
+              <w:jc w:val="left"/>
+            </w:pPr>
+            <w:r>
+              <w:rPr>
+                <w:sz w:val="18"/>
+              </w:rPr>
+              <w:t xml:space="preserve">0,89</w:t>
+            </w:r>
+          </w:p>
+        </w:tc>
+        <w:tc>
+          <w:tcPr>
+            <w:tcW w:type="dxa" w:w="2788"/>
+          </w:tcPr>
+          <w:p>
+            <w:pPr>
+              <w:pStyle w:val="Compact"/>
+              <w:spacing w:after="20" w:before="20"/>
+              <w:jc w:val="left"/>
+            </w:pPr>
+            <w:r>
+              <w:rPr>
+                <w:sz w:val="18"/>
+              </w:rPr>
+              <w:t xml:space="preserve">0,87</w:t>
+            </w:r>
+          </w:p>
+        </w:tc>
+      </w:tr>
+      <w:tr>
+        <w:tc>
+          <w:tcPr>
+            <w:tcW w:type="dxa" w:w="1715"/>
+          </w:tcPr>
+          <w:p>
+            <w:pPr>
+              <w:pStyle w:val="Compact"/>
+              <w:spacing w:after="20" w:before="20"/>
+              <w:jc w:val="left"/>
+            </w:pPr>
+            <w:r>
+              <w:rPr>
+                <w:sz w:val="18"/>
+              </w:rPr>
+              <w:t xml:space="preserve">6/2027</w:t>
+            </w:r>
+          </w:p>
+        </w:tc>
+        <w:tc>
+          <w:tcPr>
+            <w:tcW w:type="dxa" w:w="1715"/>
+          </w:tcPr>
+          <w:p>
+            <w:pPr>
+              <w:pStyle w:val="Compact"/>
+              <w:spacing w:after="20" w:before="20"/>
+              <w:jc w:val="left"/>
+            </w:pPr>
+            <w:r>
+              <w:rPr>
+                <w:sz w:val="18"/>
+              </w:rPr>
+              <w:t xml:space="preserve">0,97</w:t>
+            </w:r>
+          </w:p>
+        </w:tc>
+        <w:tc>
+          <w:tcPr>
+            <w:tcW w:type="dxa" w:w="1715"/>
+          </w:tcPr>
+          <w:p>
+            <w:pPr>
+              <w:pStyle w:val="Compact"/>
+              <w:spacing w:after="20" w:before="20"/>
+              <w:jc w:val="left"/>
+            </w:pPr>
+            <w:r>
+              <w:rPr>
+                <w:sz w:val="18"/>
+              </w:rPr>
+              <w:t xml:space="preserve">1,12</w:t>
+            </w:r>
+          </w:p>
+        </w:tc>
+        <w:tc>
+          <w:tcPr>
+            <w:tcW w:type="dxa" w:w="1715"/>
+          </w:tcPr>
+          <w:p>
+            <w:pPr>
+              <w:pStyle w:val="Compact"/>
+              <w:spacing w:after="20" w:before="20"/>
+              <w:jc w:val="left"/>
+            </w:pPr>
+            <w:r>
+              <w:rPr>
+                <w:sz w:val="18"/>
+              </w:rPr>
+              <w:t xml:space="preserve">1,22</w:t>
+            </w:r>
+          </w:p>
+        </w:tc>
+        <w:tc>
+          <w:tcPr>
+            <w:tcW w:type="dxa" w:w="1715"/>
+          </w:tcPr>
+          <w:p>
+            <w:pPr>
+              <w:pStyle w:val="Compact"/>
+              <w:spacing w:after="20" w:before="20"/>
+              <w:jc w:val="left"/>
+            </w:pPr>
+            <w:r>
+              <w:rPr>
+                <w:sz w:val="18"/>
+              </w:rPr>
+              <w:t xml:space="preserve">0,78</w:t>
+            </w:r>
+          </w:p>
+        </w:tc>
+        <w:tc>
+          <w:tcPr>
+            <w:tcW w:type="dxa" w:w="1715"/>
+          </w:tcPr>
+          <w:p>
+            <w:pPr>
+              <w:pStyle w:val="Compact"/>
+              <w:spacing w:after="20" w:before="20"/>
+              <w:jc w:val="left"/>
+            </w:pPr>
+            <w:r>
+              <w:rPr>
+                <w:sz w:val="18"/>
+              </w:rPr>
               <w:t xml:space="preserve">1,31</w:t>
             </w:r>
           </w:p>
@@ -1970,6 +2642,390 @@
               <w:rPr>
                 <w:sz w:val="18"/>
               </w:rPr>
+              <w:t xml:space="preserve">1,35</w:t>
+            </w:r>
+          </w:p>
+        </w:tc>
+        <w:tc>
+          <w:tcPr>
+            <w:tcW w:type="dxa" w:w="2788"/>
+          </w:tcPr>
+          <w:p>
+            <w:pPr>
+              <w:pStyle w:val="Compact"/>
+              <w:spacing w:after="20" w:before="20"/>
+              <w:jc w:val="left"/>
+            </w:pPr>
+            <w:r>
+              <w:rPr>
+                <w:sz w:val="18"/>
+              </w:rPr>
+              <w:t xml:space="preserve">0,27</w:t>
+            </w:r>
+          </w:p>
+        </w:tc>
+      </w:tr>
+      <w:tr>
+        <w:tc>
+          <w:tcPr>
+            <w:tcW w:type="dxa" w:w="1715"/>
+          </w:tcPr>
+          <w:p>
+            <w:pPr>
+              <w:pStyle w:val="Compact"/>
+              <w:spacing w:after="20" w:before="20"/>
+              <w:jc w:val="left"/>
+            </w:pPr>
+            <w:r>
+              <w:rPr>
+                <w:sz w:val="18"/>
+              </w:rPr>
+              <w:t xml:space="preserve">7/2027</w:t>
+            </w:r>
+          </w:p>
+        </w:tc>
+        <w:tc>
+          <w:tcPr>
+            <w:tcW w:type="dxa" w:w="1715"/>
+          </w:tcPr>
+          <w:p>
+            <w:pPr>
+              <w:pStyle w:val="Compact"/>
+              <w:spacing w:after="20" w:before="20"/>
+              <w:jc w:val="left"/>
+            </w:pPr>
+            <w:r>
+              <w:rPr>
+                <w:sz w:val="18"/>
+              </w:rPr>
+              <w:t xml:space="preserve">2,89</w:t>
+            </w:r>
+          </w:p>
+        </w:tc>
+        <w:tc>
+          <w:tcPr>
+            <w:tcW w:type="dxa" w:w="1715"/>
+          </w:tcPr>
+          <w:p>
+            <w:pPr>
+              <w:pStyle w:val="Compact"/>
+              <w:spacing w:after="20" w:before="20"/>
+              <w:jc w:val="left"/>
+            </w:pPr>
+            <w:r>
+              <w:rPr>
+                <w:sz w:val="18"/>
+              </w:rPr>
+              <w:t xml:space="preserve">0,71</w:t>
+            </w:r>
+          </w:p>
+        </w:tc>
+        <w:tc>
+          <w:tcPr>
+            <w:tcW w:type="dxa" w:w="1715"/>
+          </w:tcPr>
+          <w:p>
+            <w:pPr>
+              <w:pStyle w:val="Compact"/>
+              <w:spacing w:after="20" w:before="20"/>
+              <w:jc w:val="left"/>
+            </w:pPr>
+            <w:r>
+              <w:rPr>
+                <w:sz w:val="18"/>
+              </w:rPr>
+              <w:t xml:space="preserve">0,75</w:t>
+            </w:r>
+          </w:p>
+        </w:tc>
+        <w:tc>
+          <w:tcPr>
+            <w:tcW w:type="dxa" w:w="1715"/>
+          </w:tcPr>
+          <w:p>
+            <w:pPr>
+              <w:pStyle w:val="Compact"/>
+              <w:spacing w:after="20" w:before="20"/>
+              <w:jc w:val="left"/>
+            </w:pPr>
+            <w:r>
+              <w:rPr>
+                <w:sz w:val="18"/>
+              </w:rPr>
+              <w:t xml:space="preserve">0,74</w:t>
+            </w:r>
+          </w:p>
+        </w:tc>
+        <w:tc>
+          <w:tcPr>
+            <w:tcW w:type="dxa" w:w="1715"/>
+          </w:tcPr>
+          <w:p>
+            <w:pPr>
+              <w:pStyle w:val="Compact"/>
+              <w:spacing w:after="20" w:before="20"/>
+              <w:jc w:val="left"/>
+            </w:pPr>
+            <w:r>
+              <w:rPr>
+                <w:sz w:val="18"/>
+              </w:rPr>
+              <w:t xml:space="preserve">1,51</w:t>
+            </w:r>
+          </w:p>
+        </w:tc>
+        <w:tc>
+          <w:tcPr>
+            <w:tcW w:type="dxa" w:w="1715"/>
+          </w:tcPr>
+          <w:p>
+            <w:pPr>
+              <w:pStyle w:val="Compact"/>
+              <w:spacing w:after="20" w:before="20"/>
+              <w:jc w:val="left"/>
+            </w:pPr>
+            <w:r>
+              <w:rPr>
+                <w:sz w:val="18"/>
+              </w:rPr>
+              <w:t xml:space="preserve">0,61</w:t>
+            </w:r>
+          </w:p>
+        </w:tc>
+        <w:tc>
+          <w:tcPr>
+            <w:tcW w:type="dxa" w:w="2788"/>
+          </w:tcPr>
+          <w:p>
+            <w:pPr>
+              <w:pStyle w:val="Compact"/>
+              <w:spacing w:after="20" w:before="20"/>
+              <w:jc w:val="left"/>
+            </w:pPr>
+            <w:r>
+              <w:rPr>
+                <w:sz w:val="18"/>
+              </w:rPr>
+              <w:t xml:space="preserve">0,86</w:t>
+            </w:r>
+          </w:p>
+        </w:tc>
+      </w:tr>
+      <w:tr>
+        <w:tc>
+          <w:tcPr>
+            <w:tcW w:type="dxa" w:w="1715"/>
+          </w:tcPr>
+          <w:p>
+            <w:pPr>
+              <w:pStyle w:val="Compact"/>
+              <w:spacing w:after="20" w:before="20"/>
+              <w:jc w:val="left"/>
+            </w:pPr>
+            <w:r>
+              <w:rPr>
+                <w:sz w:val="18"/>
+              </w:rPr>
+              <w:t xml:space="preserve">8/2027</w:t>
+            </w:r>
+          </w:p>
+        </w:tc>
+        <w:tc>
+          <w:tcPr>
+            <w:tcW w:type="dxa" w:w="1715"/>
+          </w:tcPr>
+          <w:p>
+            <w:pPr>
+              <w:pStyle w:val="Compact"/>
+              <w:spacing w:after="20" w:before="20"/>
+              <w:jc w:val="left"/>
+            </w:pPr>
+            <w:r>
+              <w:rPr>
+                <w:sz w:val="18"/>
+              </w:rPr>
+              <w:t xml:space="preserve">0,90</w:t>
+            </w:r>
+          </w:p>
+        </w:tc>
+        <w:tc>
+          <w:tcPr>
+            <w:tcW w:type="dxa" w:w="1715"/>
+          </w:tcPr>
+          <w:p>
+            <w:pPr>
+              <w:pStyle w:val="Compact"/>
+              <w:spacing w:after="20" w:before="20"/>
+              <w:jc w:val="left"/>
+            </w:pPr>
+            <w:r>
+              <w:rPr>
+                <w:sz w:val="18"/>
+              </w:rPr>
+              <w:t xml:space="preserve">0,75</w:t>
+            </w:r>
+          </w:p>
+        </w:tc>
+        <w:tc>
+          <w:tcPr>
+            <w:tcW w:type="dxa" w:w="1715"/>
+          </w:tcPr>
+          <w:p>
+            <w:pPr>
+              <w:pStyle w:val="Compact"/>
+              <w:spacing w:after="20" w:before="20"/>
+              <w:jc w:val="left"/>
+            </w:pPr>
+            <w:r>
+              <w:rPr>
+                <w:sz w:val="18"/>
+              </w:rPr>
+              <w:t xml:space="preserve">0,60</w:t>
+            </w:r>
+          </w:p>
+        </w:tc>
+        <w:tc>
+          <w:tcPr>
+            <w:tcW w:type="dxa" w:w="1715"/>
+          </w:tcPr>
+          <w:p>
+            <w:pPr>
+              <w:pStyle w:val="Compact"/>
+              <w:spacing w:after="20" w:before="20"/>
+              <w:jc w:val="left"/>
+            </w:pPr>
+            <w:r>
+              <w:rPr>
+                <w:sz w:val="18"/>
+              </w:rPr>
+              <w:t xml:space="preserve">0,42</w:t>
+            </w:r>
+          </w:p>
+        </w:tc>
+        <w:tc>
+          <w:tcPr>
+            <w:tcW w:type="dxa" w:w="1715"/>
+          </w:tcPr>
+          <w:p>
+            <w:pPr>
+              <w:pStyle w:val="Compact"/>
+              <w:spacing w:after="20" w:before="20"/>
+              <w:jc w:val="left"/>
+            </w:pPr>
+            <w:r>
+              <w:rPr>
+                <w:sz w:val="18"/>
+              </w:rPr>
+              <w:t xml:space="preserve">1,34</w:t>
+            </w:r>
+          </w:p>
+        </w:tc>
+        <w:tc>
+          <w:tcPr>
+            <w:tcW w:type="dxa" w:w="1715"/>
+          </w:tcPr>
+          <w:p>
+            <w:pPr>
+              <w:pStyle w:val="Compact"/>
+              <w:spacing w:after="20" w:before="20"/>
+              <w:jc w:val="left"/>
+            </w:pPr>
+            <w:r>
+              <w:rPr>
+                <w:sz w:val="18"/>
+              </w:rPr>
+              <w:t xml:space="preserve">0,56</w:t>
+            </w:r>
+          </w:p>
+        </w:tc>
+        <w:tc>
+          <w:tcPr>
+            <w:tcW w:type="dxa" w:w="2788"/>
+          </w:tcPr>
+          <w:p>
+            <w:pPr>
+              <w:pStyle w:val="Compact"/>
+              <w:spacing w:after="20" w:before="20"/>
+              <w:jc w:val="left"/>
+            </w:pPr>
+            <w:r>
+              <w:rPr>
+                <w:sz w:val="18"/>
+              </w:rPr>
+              <w:t xml:space="preserve">0,82</w:t>
+            </w:r>
+          </w:p>
+        </w:tc>
+      </w:tr>
+      <w:tr>
+        <w:tc>
+          <w:tcPr>
+            <w:tcW w:type="dxa" w:w="1715"/>
+          </w:tcPr>
+          <w:p>
+            <w:pPr>
+              <w:pStyle w:val="Compact"/>
+              <w:spacing w:after="20" w:before="20"/>
+              <w:jc w:val="left"/>
+            </w:pPr>
+            <w:r>
+              <w:rPr>
+                <w:sz w:val="18"/>
+              </w:rPr>
+              <w:t xml:space="preserve">9/2027</w:t>
+            </w:r>
+          </w:p>
+        </w:tc>
+        <w:tc>
+          <w:tcPr>
+            <w:tcW w:type="dxa" w:w="1715"/>
+          </w:tcPr>
+          <w:p>
+            <w:pPr>
+              <w:pStyle w:val="Compact"/>
+              <w:spacing w:after="20" w:before="20"/>
+              <w:jc w:val="left"/>
+            </w:pPr>
+            <w:r>
+              <w:rPr>
+                <w:sz w:val="18"/>
+              </w:rPr>
+              <w:t xml:space="preserve">1,02</w:t>
+            </w:r>
+          </w:p>
+        </w:tc>
+        <w:tc>
+          <w:tcPr>
+            <w:tcW w:type="dxa" w:w="1715"/>
+          </w:tcPr>
+          <w:p>
+            <w:pPr>
+              <w:pStyle w:val="Compact"/>
+              <w:spacing w:after="20" w:before="20"/>
+              <w:jc w:val="left"/>
+            </w:pPr>
+            <w:r>
+              <w:rPr>
+                <w:sz w:val="18"/>
+              </w:rPr>
+              <w:t xml:space="preserve">0,65</w:t>
+            </w:r>
+          </w:p>
+        </w:tc>
+        <w:tc>
+          <w:tcPr>
+            <w:tcW w:type="dxa" w:w="1715"/>
+          </w:tcPr>
+          <w:p>
+            <w:pPr>
+              <w:pStyle w:val="Compact"/>
+              <w:spacing w:after="20" w:before="20"/>
+              <w:jc w:val="left"/>
+            </w:pPr>
+            <w:r>
+              <w:rPr>
+                <w:sz w:val="18"/>
+              </w:rPr>
               <w:t xml:space="preserve">0,46</w:t>
             </w:r>
           </w:p>
@@ -1988,6 +3044,152 @@
               <w:rPr>
                 <w:sz w:val="18"/>
               </w:rPr>
+              <w:t xml:space="preserve">0,41</w:t>
+            </w:r>
+          </w:p>
+        </w:tc>
+        <w:tc>
+          <w:tcPr>
+            <w:tcW w:type="dxa" w:w="1715"/>
+          </w:tcPr>
+          <w:p>
+            <w:pPr>
+              <w:pStyle w:val="Compact"/>
+              <w:spacing w:after="20" w:before="20"/>
+              <w:jc w:val="left"/>
+            </w:pPr>
+            <w:r>
+              <w:rPr>
+                <w:sz w:val="18"/>
+              </w:rPr>
+              <w:t xml:space="preserve">0,89</w:t>
+            </w:r>
+          </w:p>
+        </w:tc>
+        <w:tc>
+          <w:tcPr>
+            <w:tcW w:type="dxa" w:w="1715"/>
+          </w:tcPr>
+          <w:p>
+            <w:pPr>
+              <w:pStyle w:val="Compact"/>
+              <w:spacing w:after="20" w:before="20"/>
+              <w:jc w:val="left"/>
+            </w:pPr>
+            <w:r>
+              <w:rPr>
+                <w:sz w:val="18"/>
+              </w:rPr>
+              <w:t xml:space="preserve">0,48</w:t>
+            </w:r>
+          </w:p>
+        </w:tc>
+        <w:tc>
+          <w:tcPr>
+            <w:tcW w:type="dxa" w:w="2788"/>
+          </w:tcPr>
+          <w:p>
+            <w:pPr>
+              <w:pStyle w:val="Compact"/>
+              <w:spacing w:after="20" w:before="20"/>
+              <w:jc w:val="left"/>
+            </w:pPr>
+            <w:r>
+              <w:rPr>
+                <w:sz w:val="18"/>
+              </w:rPr>
+              <w:t xml:space="preserve">0,55</w:t>
+            </w:r>
+          </w:p>
+        </w:tc>
+      </w:tr>
+      <w:tr>
+        <w:tc>
+          <w:tcPr>
+            <w:tcW w:type="dxa" w:w="1715"/>
+          </w:tcPr>
+          <w:p>
+            <w:pPr>
+              <w:pStyle w:val="Compact"/>
+              <w:spacing w:after="20" w:before="20"/>
+              <w:jc w:val="left"/>
+            </w:pPr>
+            <w:r>
+              <w:rPr>
+                <w:sz w:val="18"/>
+              </w:rPr>
+              <w:t xml:space="preserve">10/2027</w:t>
+            </w:r>
+          </w:p>
+        </w:tc>
+        <w:tc>
+          <w:tcPr>
+            <w:tcW w:type="dxa" w:w="1715"/>
+          </w:tcPr>
+          <w:p>
+            <w:pPr>
+              <w:pStyle w:val="Compact"/>
+              <w:spacing w:after="20" w:before="20"/>
+              <w:jc w:val="left"/>
+            </w:pPr>
+            <w:r>
+              <w:rPr>
+                <w:sz w:val="18"/>
+              </w:rPr>
+              <w:t xml:space="preserve">1,57</w:t>
+            </w:r>
+          </w:p>
+        </w:tc>
+        <w:tc>
+          <w:tcPr>
+            <w:tcW w:type="dxa" w:w="1715"/>
+          </w:tcPr>
+          <w:p>
+            <w:pPr>
+              <w:pStyle w:val="Compact"/>
+              <w:spacing w:after="20" w:before="20"/>
+              <w:jc w:val="left"/>
+            </w:pPr>
+            <w:r>
+              <w:rPr>
+                <w:sz w:val="18"/>
+              </w:rPr>
+              <w:t xml:space="preserve">0,88</w:t>
+            </w:r>
+          </w:p>
+        </w:tc>
+        <w:tc>
+          <w:tcPr>
+            <w:tcW w:type="dxa" w:w="1715"/>
+          </w:tcPr>
+          <w:p>
+            <w:pPr>
+              <w:pStyle w:val="Compact"/>
+              <w:spacing w:after="20" w:before="20"/>
+              <w:jc w:val="left"/>
+            </w:pPr>
+            <w:r>
+              <w:rPr>
+                <w:sz w:val="18"/>
+              </w:rPr>
+              <w:t xml:space="preserve">1,01</w:t>
+            </w:r>
+          </w:p>
+        </w:tc>
+        <w:tc>
+          <w:tcPr>
+            <w:tcW w:type="dxa" w:w="1715"/>
+          </w:tcPr>
+          <w:p>
+            <w:pPr>
+              <w:pStyle w:val="Compact"/>
+              <w:spacing w:after="20" w:before="20"/>
+              <w:jc w:val="left"/>
+            </w:pPr>
+            <w:r>
+              <w:rPr>
+                <w:sz w:val="18"/>
+              </w:rPr>
               <w:t xml:space="preserve">0,65</w:t>
             </w:r>
           </w:p>
@@ -2006,43 +3208,25 @@
               <w:rPr>
                 <w:sz w:val="18"/>
               </w:rPr>
-              <w:t xml:space="preserve">0,11</w:t>
-            </w:r>
-          </w:p>
-        </w:tc>
-        <w:tc>
-          <w:tcPr>
-            <w:tcW w:type="dxa" w:w="1715"/>
-          </w:tcPr>
-          <w:p>
-            <w:pPr>
-              <w:pStyle w:val="Compact"/>
-              <w:spacing w:after="20" w:before="20"/>
-              <w:jc w:val="left"/>
-            </w:pPr>
-            <w:r>
-              <w:rPr>
-                <w:sz w:val="18"/>
-              </w:rPr>
-              <w:t xml:space="preserve">0,48</w:t>
-            </w:r>
-          </w:p>
-        </w:tc>
-        <w:tc>
-          <w:tcPr>
-            <w:tcW w:type="dxa" w:w="1715"/>
-          </w:tcPr>
-          <w:p>
-            <w:pPr>
-              <w:pStyle w:val="Compact"/>
-              <w:spacing w:after="20" w:before="20"/>
-              <w:jc w:val="left"/>
-            </w:pPr>
-            <w:r>
-              <w:rPr>
-                <w:sz w:val="18"/>
-              </w:rPr>
-              <w:t xml:space="preserve">0,54</w:t>
+              <w:t xml:space="preserve">1,14</w:t>
+            </w:r>
+          </w:p>
+        </w:tc>
+        <w:tc>
+          <w:tcPr>
+            <w:tcW w:type="dxa" w:w="1715"/>
+          </w:tcPr>
+          <w:p>
+            <w:pPr>
+              <w:pStyle w:val="Compact"/>
+              <w:spacing w:after="20" w:before="20"/>
+              <w:jc w:val="left"/>
+            </w:pPr>
+            <w:r>
+              <w:rPr>
+                <w:sz w:val="18"/>
+              </w:rPr>
+              <w:t xml:space="preserve">1,27</w:t>
             </w:r>
           </w:p>
         </w:tc>
@@ -2060,7 +3244,7 @@
               <w:rPr>
                 <w:sz w:val="18"/>
               </w:rPr>
-              <w:t xml:space="preserve">0,81</w:t>
+              <w:t xml:space="preserve">0,84</w:t>
             </w:r>
           </w:p>
         </w:tc>
@@ -2071,7 +3255,68 @@
         <w:pStyle w:val="BodyText"/>
       </w:pPr>
       <w:r>
-        <w:t xml:space="preserve">Điểm cần theo dõi: tháng 11 cả nhóm cao điểm (mẫu triển lãm 27FW + PPS 27SS + đơn mẫu tồn; phòng mẫu vượt công suất); Cường cao điểm tháng 12 (21 mã HELLY HANSEN vào chuyền); Huy cao điểm tháng 1 (25 mã TNF 別注 HOSOYA); Khánh tháng 12 ~1,25 (nên giữ hỗ trợ Luân ~25%).</w:t>
+        <w:t xml:space="preserve">Điểm cần theo dõi: tháng 11 nặng nhất cả nhóm; Cường cao điểm 12, 2 (Tết ít ngày làm),</w:t>
+      </w:r>
+      <w:r>
+        <w:t xml:space="preserve"> </w:t>
+      </w:r>
+      <w:r>
+        <w:rPr>
+          <w:bCs/>
+          <w:b/>
+        </w:rPr>
+        <w:t xml:space="preserve">7</w:t>
+      </w:r>
+      <w:r>
+        <w:t xml:space="preserve"> </w:t>
+      </w:r>
+      <w:r>
+        <w:t xml:space="preserve">(mẫu 1st FW HELLY HANSEN), 10; Luân 11–12 và</w:t>
+      </w:r>
+      <w:r>
+        <w:t xml:space="preserve"> </w:t>
+      </w:r>
+      <w:r>
+        <w:rPr>
+          <w:bCs/>
+          <w:b/>
+        </w:rPr>
+        <w:t xml:space="preserve">3–5</w:t>
+      </w:r>
+      <w:r>
+        <w:t xml:space="preserve"> </w:t>
+      </w:r>
+      <w:r>
+        <w:t xml:space="preserve">(hàng FW vào chuyền); Huy 11, 1,</w:t>
+      </w:r>
+      <w:r>
+        <w:t xml:space="preserve"> </w:t>
+      </w:r>
+      <w:r>
+        <w:rPr>
+          <w:bCs/>
+          <w:b/>
+        </w:rPr>
+        <w:t xml:space="preserve">5</w:t>
+      </w:r>
+      <w:r>
+        <w:t xml:space="preserve">;</w:t>
+      </w:r>
+      <w:r>
+        <w:t xml:space="preserve"> </w:t>
+      </w:r>
+      <w:r>
+        <w:rPr>
+          <w:bCs/>
+          <w:b/>
+        </w:rPr>
+        <w:t xml:space="preserve">Như tháng 4</w:t>
+      </w:r>
+      <w:r>
+        <w:t xml:space="preserve"> </w:t>
+      </w:r>
+      <w:r>
+        <w:t xml:space="preserve">(40 mã TNF 別注 FW vào chuyền); Hiền 11–12, 6. Bích Trang thấp có thể do thiếu dữ liệu các brand mới.</w:t>
       </w:r>
     </w:p>
     <w:bookmarkEnd w:id="23"/>
@@ -2668,6 +3913,63 @@
                 <w:rStyle w:val="VerbatimChar"/>
                 <w:sz w:val="18"/>
               </w:rPr>
+              <w:t xml:space="preserve">Lich-nghi-thu-7-TIVN-APIC-2026-20260811.xlsx</w:t>
+            </w:r>
+          </w:p>
+        </w:tc>
+        <w:tc>
+          <w:tcPr>
+            <w:tcW w:type="dxa" w:w="5433"/>
+          </w:tcPr>
+          <w:p>
+            <w:pPr>
+              <w:pStyle w:val="Compact"/>
+              <w:spacing w:after="20" w:before="20"/>
+              <w:jc w:val="left"/>
+            </w:pPr>
+            <w:r>
+              <w:rPr>
+                <w:sz w:val="18"/>
+              </w:rPr>
+              <w:t xml:space="preserve">Lịch nghỉ thứ 7 theo nhóm A (Luân, Khánh, Như, Huy, Bích Trang…) / B (Cường, Hiền…), kỳ lương 26–25</w:t>
+            </w:r>
+          </w:p>
+        </w:tc>
+        <w:tc>
+          <w:tcPr>
+            <w:tcW w:type="dxa" w:w="5433"/>
+          </w:tcPr>
+          <w:p>
+            <w:pPr>
+              <w:pStyle w:val="Compact"/>
+              <w:spacing w:after="20" w:before="20"/>
+              <w:jc w:val="left"/>
+            </w:pPr>
+            <w:r>
+              <w:rPr>
+                <w:sz w:val="18"/>
+              </w:rPr>
+              <w:t xml:space="preserve">Chỉ đến 3/2027; chưa có ngày lễ, Tết</w:t>
+            </w:r>
+          </w:p>
+        </w:tc>
+      </w:tr>
+      <w:tr>
+        <w:tc>
+          <w:tcPr>
+            <w:tcW w:type="dxa" w:w="3931"/>
+          </w:tcPr>
+          <w:p>
+            <w:pPr>
+              <w:pStyle w:val="Compact"/>
+              <w:spacing w:after="20" w:before="20"/>
+              <w:jc w:val="left"/>
+            </w:pPr>
+            <w:r>
+              <w:rPr>
+                <w:rStyle w:val="VerbatimChar"/>
+                <w:sz w:val="18"/>
+              </w:rPr>
               <w:t xml:space="preserve">APIC-MD-Best-Practice-Handbook.docx</w:t>
             </w:r>
           </w:p>
@@ -2817,7 +4119,7 @@
           <w:bCs/>
           <w:b/>
         </w:rPr>
-        <w:t xml:space="preserve">Tải theo tháng</w:t>
+        <w:t xml:space="preserve">Tải 12 tháng</w:t>
       </w:r>
       <w:r>
         <w:t xml:space="preserve"> </w:t>
@@ -2829,10 +4131,32 @@
         <w:rPr>
           <w:rStyle w:val="VerbatimChar"/>
         </w:rPr>
-        <w:t xml:space="preserve">ke-hoach-thang.py</w:t>
-      </w:r>
-      <w:r>
-        <w:t xml:space="preserve">): mã vào chuyền (mỗi mã tính 1 lần dù nhiều lô), ngày chuyền đang chạy (theo lô), đơn mẫu = đơn tồn (hạn ≤ 10/2026, chưa xong, dồn vào tháng 11) + số đơn cùng tháng năm trước theo brand; trọng số loại mẫu: 1st/0次 1,0; 2nd 0,8; PPS/mockup 0,6; SMS 0,5; khác 0,3. Mốc 1,0 chung cho cả 4 tháng.</w:t>
+        <w:t xml:space="preserve">ke-hoach-nam.py</w:t>
+      </w:r>
+      <w:r>
+        <w:t xml:space="preserve">, dùng chính): sản xuất mùa đến 27SS lấy lịch thật trong Plantable; 27FW, 28SS lấy lịch của 26FW, 27SS năm trước dời 52 tuần; mẫu = đơn tồn (dồn vào 11/2026) + cùng tháng năm trước; công suất = ngày làm việc thực từng người (</w:t>
+      </w:r>
+      <w:r>
+        <w:rPr>
+          <w:rStyle w:val="VerbatimChar"/>
+        </w:rPr>
+        <w:t xml:space="preserve">lich_lam_viec.py</w:t>
+      </w:r>
+      <w:r>
+        <w:t xml:space="preserve">: thứ 2–7, nghỉ thứ 7 theo nhóm, trừ lễ;</w:t>
+      </w:r>
+      <w:r>
+        <w:t xml:space="preserve"> </w:t>
+      </w:r>
+      <w:r>
+        <w:rPr>
+          <w:bCs/>
+          <w:b/>
+        </w:rPr>
+        <w:t xml:space="preserve">Tết 2027 tạm 4–12/2, Giỗ Tổ tạm 16/4 – giả định</w:t>
+      </w:r>
+      <w:r>
+        <w:t xml:space="preserve">) × giờ/ngày; mốc 1,0 = trung bình 1 ngày công cả 12 tháng.</w:t>
       </w:r>
     </w:p>
     <w:p>
@@ -2848,7 +4172,7 @@
           <w:bCs/>
           <w:b/>
         </w:rPr>
-        <w:t xml:space="preserve">Mùa vừa qua</w:t>
+        <w:t xml:space="preserve">Tải 4 tháng</w:t>
       </w:r>
       <w:r>
         <w:t xml:space="preserve"> </w:t>
@@ -2860,10 +4184,10 @@
         <w:rPr>
           <w:rStyle w:val="VerbatimChar"/>
         </w:rPr>
-        <w:t xml:space="preserve">build.py</w:t>
-      </w:r>
-      <w:r>
-        <w:t xml:space="preserve">): bulk 26FW + 27SS, mẫu 27SS; Khánh (nghỉ) và H.Trang (CAD) không tính vào mức trung bình.</w:t>
+        <w:t xml:space="preserve">ke-hoach-thang.py</w:t>
+      </w:r>
+      <w:r>
+        <w:t xml:space="preserve">, bản trước, không còn trong tài liệu): mã vào chuyền (mỗi mã tính 1 lần dù nhiều lô), ngày chuyền đang chạy (theo lô), đơn mẫu = đơn tồn (hạn ≤ 10/2026, chưa xong, dồn vào tháng 11) + số đơn cùng tháng năm trước theo brand; trọng số loại mẫu: 1st/0次 1,0; 2nd 0,8; PPS/mockup 0,6; SMS 0,5; khác 0,3. Mốc 1,0 chung cho cả 4 tháng.</w:t>
       </w:r>
     </w:p>
     <w:p>
@@ -2876,6 +4200,37 @@
       </w:pPr>
       <w:r>
         <w:rPr>
+          <w:bCs/>
+          <w:b/>
+        </w:rPr>
+        <w:t xml:space="preserve">Mùa vừa qua</w:t>
+      </w:r>
+      <w:r>
+        <w:t xml:space="preserve"> </w:t>
+      </w:r>
+      <w:r>
+        <w:t xml:space="preserve">(</w:t>
+      </w:r>
+      <w:r>
+        <w:rPr>
+          <w:rStyle w:val="VerbatimChar"/>
+        </w:rPr>
+        <w:t xml:space="preserve">build.py</w:t>
+      </w:r>
+      <w:r>
+        <w:t xml:space="preserve">): bulk 26FW + 27SS, mẫu 27SS; Khánh (nghỉ) và H.Trang (CAD) không tính vào mức trung bình.</w:t>
+      </w:r>
+    </w:p>
+    <w:p>
+      <w:pPr>
+        <w:numPr>
+          <w:ilvl w:val="0"/>
+          <w:numId w:val="1002"/>
+        </w:numPr>
+        <w:pStyle w:val="Compact"/>
+      </w:pPr>
+      <w:r>
+        <w:rPr>
           <w:rStyle w:val="VerbatimChar"/>
         </w:rPr>
         <w:t xml:space="preserve">du-bao.py</w:t>
@@ -2983,7 +4338,7 @@
         <w:rPr>
           <w:rStyle w:val="VerbatimChar"/>
         </w:rPr>
-        <w:t xml:space="preserve">python3 data/khoi-luong/trich-ke-hoach.py            # trích Plantable + file mẫu → plantable-10-2026-3-2027.json, mau-2025-2026.json</w:t>
+        <w:t xml:space="preserve">python3 data/khoi-luong/trich-ke-hoach.py data/nguon/APIC-P-Plan-Plantable-2026-20261026.xlsm data/nguon/APIC-Sample-20261023.xlsx 2025-11-01 2027-04-30 data/khoi-luong/plantable-11-2025-4-2027.json</w:t>
       </w:r>
       <w:r>
         <w:br/>
@@ -2992,7 +4347,25 @@
         <w:rPr>
           <w:rStyle w:val="VerbatimChar"/>
         </w:rPr>
-        <w:t xml:space="preserve">python3 data/khoi-luong/ke-hoach-thang.py            # tải theo tháng → ke-hoach-thang.json</w:t>
+        <w:t xml:space="preserve">                                                      # trích Plantable (11/2025 – 4/2027) + file mẫu → mau-2025-2026.json</w:t>
+      </w:r>
+      <w:r>
+        <w:br/>
+      </w:r>
+      <w:r>
+        <w:rPr>
+          <w:rStyle w:val="VerbatimChar"/>
+        </w:rPr>
+        <w:t xml:space="preserve">python3 data/khoi-luong/ke-hoach-nam.py              # tải 12 tháng → ke-hoach-nam.json</w:t>
+      </w:r>
+      <w:r>
+        <w:br/>
+      </w:r>
+      <w:r>
+        <w:rPr>
+          <w:rStyle w:val="VerbatimChar"/>
+        </w:rPr>
+        <w:t xml:space="preserve">python3 data/khoi-luong/lich_lam_viec.py             # xem số ngày làm việc từng tháng</w:t>
       </w:r>
       <w:r>
         <w:br/>
@@ -3079,7 +4452,7 @@
         <w:t xml:space="preserve"> </w:t>
       </w:r>
       <w:r>
-        <w:t xml:space="preserve">(mặc định 1/10/2026 – 31/3/2027; tự loại dòng mùa cũ hơn 26FW), rồi sửa danh sách</w:t>
+        <w:t xml:space="preserve">(lấy từ 12 tháng trước giai đoạn tính để có lịch năm trước; tự loại dòng mùa cũ hơn 26SS), rồi sửa</w:t>
       </w:r>
       <w:r>
         <w:t xml:space="preserve"> </w:t>
@@ -3094,7 +4467,7 @@
         <w:t xml:space="preserve"> </w:t>
       </w:r>
       <w:r>
-        <w:t xml:space="preserve">trong</w:t>
+        <w:t xml:space="preserve">và</w:t>
       </w:r>
       <w:r>
         <w:t xml:space="preserve"> </w:t>
@@ -3103,13 +4476,40 @@
         <w:rPr>
           <w:rStyle w:val="VerbatimChar"/>
         </w:rPr>
-        <w:t xml:space="preserve">ke-hoach-thang.py</w:t>
+        <w:t xml:space="preserve">MUA_CO_KE_HOACH</w:t>
       </w:r>
       <w:r>
         <w:t xml:space="preserve"> </w:t>
       </w:r>
       <w:r>
-        <w:t xml:space="preserve">nếu đổi giai đoạn. Script đã kiểm tra: chạy lại cho đúng các số trong tài liệu. Bảng số trong</w:t>
+        <w:t xml:space="preserve">trong</w:t>
+      </w:r>
+      <w:r>
+        <w:t xml:space="preserve"> </w:t>
+      </w:r>
+      <w:r>
+        <w:rPr>
+          <w:rStyle w:val="VerbatimChar"/>
+        </w:rPr>
+        <w:t xml:space="preserve">ke-hoach-nam.py</w:t>
+      </w:r>
+      <w:r>
+        <w:t xml:space="preserve"> </w:t>
+      </w:r>
+      <w:r>
+        <w:t xml:space="preserve">khi chuyển sang giai đoạn mới. Khi có lịch nghỉ thứ 7 / lịch Tết mới thì sửa</w:t>
+      </w:r>
+      <w:r>
+        <w:t xml:space="preserve"> </w:t>
+      </w:r>
+      <w:r>
+        <w:rPr>
+          <w:rStyle w:val="VerbatimChar"/>
+        </w:rPr>
+        <w:t xml:space="preserve">lich_lam_viec.py</w:t>
+      </w:r>
+      <w:r>
+        <w:t xml:space="preserve">. Bảng số trong</w:t>
       </w:r>
       <w:r>
         <w:t xml:space="preserve"> </w:t>
@@ -3124,7 +4524,7 @@
         <w:t xml:space="preserve"> </w:t>
       </w:r>
       <w:r>
-        <w:t xml:space="preserve">(mục "Tải theo tháng") đang viết tay theo</w:t>
+        <w:t xml:space="preserve">(mục "Tải theo tháng cả vòng 12 tháng") được viết theo</w:t>
       </w:r>
       <w:r>
         <w:t xml:space="preserve"> </w:t>
@@ -3133,7 +4533,7 @@
         <w:rPr>
           <w:rStyle w:val="VerbatimChar"/>
         </w:rPr>
-        <w:t xml:space="preserve">ke-hoach-thang.json</w:t>
+        <w:t xml:space="preserve">ke-hoach-nam.json</w:t>
       </w:r>
       <w:r>
         <w:t xml:space="preserve"> </w:t>
@@ -3291,6 +4691,41 @@
       </w:r>
       <w:r>
         <w:t xml:space="preserve">(gồm H.Trang): quản lý muốn làm sau, tách riêng khỏi MD.</w:t>
+      </w:r>
+    </w:p>
+    <w:p>
+      <w:pPr>
+        <w:numPr>
+          <w:ilvl w:val="0"/>
+          <w:numId w:val="1003"/>
+        </w:numPr>
+        <w:pStyle w:val="Compact"/>
+      </w:pPr>
+      <w:r>
+        <w:rPr>
+          <w:bCs/>
+          <w:b/>
+        </w:rPr>
+        <w:t xml:space="preserve">Lịch Tết 2027 và ngày lễ của công ty</w:t>
+      </w:r>
+      <w:r>
+        <w:t xml:space="preserve">, lịch nghỉ thứ 7 sau 3/2027 (đang giả định).</w:t>
+      </w:r>
+      <w:r>
+        <w:t xml:space="preserve"> </w:t>
+      </w:r>
+      <w:r>
+        <w:rPr>
+          <w:bCs/>
+          <w:b/>
+        </w:rPr>
+        <w:t xml:space="preserve">Kế hoạch 27FW/28SS thật</w:t>
+      </w:r>
+      <w:r>
+        <w:t xml:space="preserve"> </w:t>
+      </w:r>
+      <w:r>
+        <w:t xml:space="preserve">để thay số ước từ 4/2027.</w:t>
       </w:r>
     </w:p>
     <w:p>

</xml_diff>

<commit_message>
Lịch nghỉ lễ công ty: 24/11/2026, Tết 4–14/2/2027; tính lại tải 12 tháng
Co-Authored-By: Claude Opus 5.5 <noreply@anthropic.com>
Claude-Session: https://claude.ai/code/session_01GJjWaqKTGo1Zrw6K7RRJy3
</commit_message>
<xml_diff>
--- a/docs/tai-ve/Ban-giao-phan-tich-MD-APIC.docx
+++ b/docs/tai-ve/Ban-giao-phan-tich-MD-APIC.docx
@@ -1530,97 +1530,97 @@
               <w:rPr>
                 <w:sz w:val="18"/>
               </w:rPr>
-              <w:t xml:space="preserve">1,66</w:t>
-            </w:r>
-          </w:p>
-        </w:tc>
-        <w:tc>
-          <w:tcPr>
-            <w:tcW w:type="dxa" w:w="1715"/>
-          </w:tcPr>
-          <w:p>
-            <w:pPr>
-              <w:pStyle w:val="Compact"/>
-              <w:spacing w:after="20" w:before="20"/>
-              <w:jc w:val="left"/>
-            </w:pPr>
-            <w:r>
-              <w:rPr>
-                <w:sz w:val="18"/>
-              </w:rPr>
-              <w:t xml:space="preserve">1,81</w:t>
-            </w:r>
-          </w:p>
-        </w:tc>
-        <w:tc>
-          <w:tcPr>
-            <w:tcW w:type="dxa" w:w="1715"/>
-          </w:tcPr>
-          <w:p>
-            <w:pPr>
-              <w:pStyle w:val="Compact"/>
-              <w:spacing w:after="20" w:before="20"/>
-              <w:jc w:val="left"/>
-            </w:pPr>
-            <w:r>
-              <w:rPr>
-                <w:sz w:val="18"/>
-              </w:rPr>
-              <w:t xml:space="preserve">0,94</w:t>
-            </w:r>
-          </w:p>
-        </w:tc>
-        <w:tc>
-          <w:tcPr>
-            <w:tcW w:type="dxa" w:w="1715"/>
-          </w:tcPr>
-          <w:p>
-            <w:pPr>
-              <w:pStyle w:val="Compact"/>
-              <w:spacing w:after="20" w:before="20"/>
-              <w:jc w:val="left"/>
-            </w:pPr>
-            <w:r>
-              <w:rPr>
-                <w:sz w:val="18"/>
-              </w:rPr>
-              <w:t xml:space="preserve">1,36</w:t>
-            </w:r>
-          </w:p>
-        </w:tc>
-        <w:tc>
-          <w:tcPr>
-            <w:tcW w:type="dxa" w:w="1715"/>
-          </w:tcPr>
-          <w:p>
-            <w:pPr>
-              <w:pStyle w:val="Compact"/>
-              <w:spacing w:after="20" w:before="20"/>
-              <w:jc w:val="left"/>
-            </w:pPr>
-            <w:r>
-              <w:rPr>
-                <w:sz w:val="18"/>
-              </w:rPr>
-              <w:t xml:space="preserve">1,63</w:t>
-            </w:r>
-          </w:p>
-        </w:tc>
-        <w:tc>
-          <w:tcPr>
-            <w:tcW w:type="dxa" w:w="1715"/>
-          </w:tcPr>
-          <w:p>
-            <w:pPr>
-              <w:pStyle w:val="Compact"/>
-              <w:spacing w:after="20" w:before="20"/>
-              <w:jc w:val="left"/>
-            </w:pPr>
-            <w:r>
-              <w:rPr>
-                <w:sz w:val="18"/>
-              </w:rPr>
-              <w:t xml:space="preserve">1,41</w:t>
+              <w:t xml:space="preserve">1,72</w:t>
+            </w:r>
+          </w:p>
+        </w:tc>
+        <w:tc>
+          <w:tcPr>
+            <w:tcW w:type="dxa" w:w="1715"/>
+          </w:tcPr>
+          <w:p>
+            <w:pPr>
+              <w:pStyle w:val="Compact"/>
+              <w:spacing w:after="20" w:before="20"/>
+              <w:jc w:val="left"/>
+            </w:pPr>
+            <w:r>
+              <w:rPr>
+                <w:sz w:val="18"/>
+              </w:rPr>
+              <w:t xml:space="preserve">1,85</w:t>
+            </w:r>
+          </w:p>
+        </w:tc>
+        <w:tc>
+          <w:tcPr>
+            <w:tcW w:type="dxa" w:w="1715"/>
+          </w:tcPr>
+          <w:p>
+            <w:pPr>
+              <w:pStyle w:val="Compact"/>
+              <w:spacing w:after="20" w:before="20"/>
+              <w:jc w:val="left"/>
+            </w:pPr>
+            <w:r>
+              <w:rPr>
+                <w:sz w:val="18"/>
+              </w:rPr>
+              <w:t xml:space="preserve">0,97</w:t>
+            </w:r>
+          </w:p>
+        </w:tc>
+        <w:tc>
+          <w:tcPr>
+            <w:tcW w:type="dxa" w:w="1715"/>
+          </w:tcPr>
+          <w:p>
+            <w:pPr>
+              <w:pStyle w:val="Compact"/>
+              <w:spacing w:after="20" w:before="20"/>
+              <w:jc w:val="left"/>
+            </w:pPr>
+            <w:r>
+              <w:rPr>
+                <w:sz w:val="18"/>
+              </w:rPr>
+              <w:t xml:space="preserve">1,42</w:t>
+            </w:r>
+          </w:p>
+        </w:tc>
+        <w:tc>
+          <w:tcPr>
+            <w:tcW w:type="dxa" w:w="1715"/>
+          </w:tcPr>
+          <w:p>
+            <w:pPr>
+              <w:pStyle w:val="Compact"/>
+              <w:spacing w:after="20" w:before="20"/>
+              <w:jc w:val="left"/>
+            </w:pPr>
+            <w:r>
+              <w:rPr>
+                <w:sz w:val="18"/>
+              </w:rPr>
+              <w:t xml:space="preserve">1,69</w:t>
+            </w:r>
+          </w:p>
+        </w:tc>
+        <w:tc>
+          <w:tcPr>
+            <w:tcW w:type="dxa" w:w="1715"/>
+          </w:tcPr>
+          <w:p>
+            <w:pPr>
+              <w:pStyle w:val="Compact"/>
+              <w:spacing w:after="20" w:before="20"/>
+              <w:jc w:val="left"/>
+            </w:pPr>
+            <w:r>
+              <w:rPr>
+                <w:sz w:val="18"/>
+              </w:rPr>
+              <w:t xml:space="preserve">1,46</w:t>
             </w:r>
           </w:p>
         </w:tc>
@@ -1638,7 +1638,7 @@
               <w:rPr>
                 <w:sz w:val="18"/>
               </w:rPr>
-              <w:t xml:space="preserve">1,09</w:t>
+              <w:t xml:space="preserve">1,13</w:t>
             </w:r>
           </w:p>
         </w:tc>
@@ -1676,7 +1676,7 @@
               <w:rPr>
                 <w:sz w:val="18"/>
               </w:rPr>
-              <w:t xml:space="preserve">1,95</w:t>
+              <w:t xml:space="preserve">1,94</w:t>
             </w:r>
           </w:p>
         </w:tc>
@@ -1712,7 +1712,7 @@
               <w:rPr>
                 <w:sz w:val="18"/>
               </w:rPr>
-              <w:t xml:space="preserve">1,22</w:t>
+              <w:t xml:space="preserve">1,21</w:t>
             </w:r>
           </w:p>
         </w:tc>
@@ -1766,7 +1766,7 @@
               <w:rPr>
                 <w:sz w:val="18"/>
               </w:rPr>
-              <w:t xml:space="preserve">1,32</w:t>
+              <w:t xml:space="preserve">1,31</w:t>
             </w:r>
           </w:p>
         </w:tc>
@@ -1822,7 +1822,7 @@
               <w:rPr>
                 <w:sz w:val="18"/>
               </w:rPr>
-              <w:t xml:space="preserve">1,38</w:t>
+              <w:t xml:space="preserve">1,37</w:t>
             </w:r>
           </w:p>
         </w:tc>
@@ -1968,43 +1968,43 @@
               <w:rPr>
                 <w:sz w:val="18"/>
               </w:rPr>
-              <w:t xml:space="preserve">1,93</w:t>
-            </w:r>
-          </w:p>
-        </w:tc>
-        <w:tc>
-          <w:tcPr>
-            <w:tcW w:type="dxa" w:w="1715"/>
-          </w:tcPr>
-          <w:p>
-            <w:pPr>
-              <w:pStyle w:val="Compact"/>
-              <w:spacing w:after="20" w:before="20"/>
-              <w:jc w:val="left"/>
-            </w:pPr>
-            <w:r>
-              <w:rPr>
-                <w:sz w:val="18"/>
-              </w:rPr>
-              <w:t xml:space="preserve">0,91</w:t>
-            </w:r>
-          </w:p>
-        </w:tc>
-        <w:tc>
-          <w:tcPr>
-            <w:tcW w:type="dxa" w:w="1715"/>
-          </w:tcPr>
-          <w:p>
-            <w:pPr>
-              <w:pStyle w:val="Compact"/>
-              <w:spacing w:after="20" w:before="20"/>
-              <w:jc w:val="left"/>
-            </w:pPr>
-            <w:r>
-              <w:rPr>
-                <w:sz w:val="18"/>
-              </w:rPr>
-              <w:t xml:space="preserve">0,99</w:t>
+              <w:t xml:space="preserve">2,04</w:t>
+            </w:r>
+          </w:p>
+        </w:tc>
+        <w:tc>
+          <w:tcPr>
+            <w:tcW w:type="dxa" w:w="1715"/>
+          </w:tcPr>
+          <w:p>
+            <w:pPr>
+              <w:pStyle w:val="Compact"/>
+              <w:spacing w:after="20" w:before="20"/>
+              <w:jc w:val="left"/>
+            </w:pPr>
+            <w:r>
+              <w:rPr>
+                <w:sz w:val="18"/>
+              </w:rPr>
+              <w:t xml:space="preserve">0,87</w:t>
+            </w:r>
+          </w:p>
+        </w:tc>
+        <w:tc>
+          <w:tcPr>
+            <w:tcW w:type="dxa" w:w="1715"/>
+          </w:tcPr>
+          <w:p>
+            <w:pPr>
+              <w:pStyle w:val="Compact"/>
+              <w:spacing w:after="20" w:before="20"/>
+              <w:jc w:val="left"/>
+            </w:pPr>
+            <w:r>
+              <w:rPr>
+                <w:sz w:val="18"/>
+              </w:rPr>
+              <w:t xml:space="preserve">0,96</w:t>
             </w:r>
           </w:p>
         </w:tc>
@@ -2040,25 +2040,25 @@
               <w:rPr>
                 <w:sz w:val="18"/>
               </w:rPr>
-              <w:t xml:space="preserve">0,70</w:t>
-            </w:r>
-          </w:p>
-        </w:tc>
-        <w:tc>
-          <w:tcPr>
-            <w:tcW w:type="dxa" w:w="1715"/>
-          </w:tcPr>
-          <w:p>
-            <w:pPr>
-              <w:pStyle w:val="Compact"/>
-              <w:spacing w:after="20" w:before="20"/>
-              <w:jc w:val="left"/>
-            </w:pPr>
-            <w:r>
-              <w:rPr>
-                <w:sz w:val="18"/>
-              </w:rPr>
-              <w:t xml:space="preserve">0,88</w:t>
+              <w:t xml:space="preserve">0,68</w:t>
+            </w:r>
+          </w:p>
+        </w:tc>
+        <w:tc>
+          <w:tcPr>
+            <w:tcW w:type="dxa" w:w="1715"/>
+          </w:tcPr>
+          <w:p>
+            <w:pPr>
+              <w:pStyle w:val="Compact"/>
+              <w:spacing w:after="20" w:before="20"/>
+              <w:jc w:val="left"/>
+            </w:pPr>
+            <w:r>
+              <w:rPr>
+                <w:sz w:val="18"/>
+              </w:rPr>
+              <w:t xml:space="preserve">0,93</w:t>
             </w:r>
           </w:p>
         </w:tc>
@@ -2076,7 +2076,7 @@
               <w:rPr>
                 <w:sz w:val="18"/>
               </w:rPr>
-              <w:t xml:space="preserve">1,22</w:t>
+              <w:t xml:space="preserve">1,20</w:t>
             </w:r>
           </w:p>
         </w:tc>
@@ -2114,7 +2114,7 @@
               <w:rPr>
                 <w:sz w:val="18"/>
               </w:rPr>
-              <w:t xml:space="preserve">0,81</w:t>
+              <w:t xml:space="preserve">0,80</w:t>
             </w:r>
           </w:p>
         </w:tc>
@@ -2222,7 +2222,7 @@
               <w:rPr>
                 <w:sz w:val="18"/>
               </w:rPr>
-              <w:t xml:space="preserve">1,13</w:t>
+              <w:t xml:space="preserve">1,12</w:t>
             </w:r>
           </w:p>
         </w:tc>
@@ -2314,7 +2314,7 @@
               <w:rPr>
                 <w:sz w:val="18"/>
               </w:rPr>
-              <w:t xml:space="preserve">0,42</w:t>
+              <w:t xml:space="preserve">0,41</w:t>
             </w:r>
           </w:p>
         </w:tc>
@@ -2368,7 +2368,7 @@
               <w:rPr>
                 <w:sz w:val="18"/>
               </w:rPr>
-              <w:t xml:space="preserve">2,57</w:t>
+              <w:t xml:space="preserve">2,56</w:t>
             </w:r>
           </w:p>
         </w:tc>
@@ -2406,115 +2406,115 @@
               <w:rPr>
                 <w:sz w:val="18"/>
               </w:rPr>
+              <w:t xml:space="preserve">0,85</w:t>
+            </w:r>
+          </w:p>
+        </w:tc>
+        <w:tc>
+          <w:tcPr>
+            <w:tcW w:type="dxa" w:w="1715"/>
+          </w:tcPr>
+          <w:p>
+            <w:pPr>
+              <w:pStyle w:val="Compact"/>
+              <w:spacing w:after="20" w:before="20"/>
+              <w:jc w:val="left"/>
+            </w:pPr>
+            <w:r>
+              <w:rPr>
+                <w:sz w:val="18"/>
+              </w:rPr>
+              <w:t xml:space="preserve">1,52</w:t>
+            </w:r>
+          </w:p>
+        </w:tc>
+        <w:tc>
+          <w:tcPr>
+            <w:tcW w:type="dxa" w:w="1715"/>
+          </w:tcPr>
+          <w:p>
+            <w:pPr>
+              <w:pStyle w:val="Compact"/>
+              <w:spacing w:after="20" w:before="20"/>
+              <w:jc w:val="left"/>
+            </w:pPr>
+            <w:r>
+              <w:rPr>
+                <w:sz w:val="18"/>
+              </w:rPr>
+              <w:t xml:space="preserve">1,04</w:t>
+            </w:r>
+          </w:p>
+        </w:tc>
+        <w:tc>
+          <w:tcPr>
+            <w:tcW w:type="dxa" w:w="1715"/>
+          </w:tcPr>
+          <w:p>
+            <w:pPr>
+              <w:pStyle w:val="Compact"/>
+              <w:spacing w:after="20" w:before="20"/>
+              <w:jc w:val="left"/>
+            </w:pPr>
+            <w:r>
+              <w:rPr>
+                <w:sz w:val="18"/>
+              </w:rPr>
+              <w:t xml:space="preserve">0,40</w:t>
+            </w:r>
+          </w:p>
+        </w:tc>
+        <w:tc>
+          <w:tcPr>
+            <w:tcW w:type="dxa" w:w="1715"/>
+          </w:tcPr>
+          <w:p>
+            <w:pPr>
+              <w:pStyle w:val="Compact"/>
+              <w:spacing w:after="20" w:before="20"/>
+              <w:jc w:val="left"/>
+            </w:pPr>
+            <w:r>
+              <w:rPr>
+                <w:sz w:val="18"/>
+              </w:rPr>
+              <w:t xml:space="preserve">1,69</w:t>
+            </w:r>
+          </w:p>
+        </w:tc>
+        <w:tc>
+          <w:tcPr>
+            <w:tcW w:type="dxa" w:w="1715"/>
+          </w:tcPr>
+          <w:p>
+            <w:pPr>
+              <w:pStyle w:val="Compact"/>
+              <w:spacing w:after="20" w:before="20"/>
+              <w:jc w:val="left"/>
+            </w:pPr>
+            <w:r>
+              <w:rPr>
+                <w:sz w:val="18"/>
+              </w:rPr>
+              <w:t xml:space="preserve">0,89</w:t>
+            </w:r>
+          </w:p>
+        </w:tc>
+        <w:tc>
+          <w:tcPr>
+            <w:tcW w:type="dxa" w:w="2788"/>
+          </w:tcPr>
+          <w:p>
+            <w:pPr>
+              <w:pStyle w:val="Compact"/>
+              <w:spacing w:after="20" w:before="20"/>
+              <w:jc w:val="left"/>
+            </w:pPr>
+            <w:r>
+              <w:rPr>
+                <w:sz w:val="18"/>
+              </w:rPr>
               <w:t xml:space="preserve">0,86</w:t>
-            </w:r>
-          </w:p>
-        </w:tc>
-        <w:tc>
-          <w:tcPr>
-            <w:tcW w:type="dxa" w:w="1715"/>
-          </w:tcPr>
-          <w:p>
-            <w:pPr>
-              <w:pStyle w:val="Compact"/>
-              <w:spacing w:after="20" w:before="20"/>
-              <w:jc w:val="left"/>
-            </w:pPr>
-            <w:r>
-              <w:rPr>
-                <w:sz w:val="18"/>
-              </w:rPr>
-              <w:t xml:space="preserve">1,53</w:t>
-            </w:r>
-          </w:p>
-        </w:tc>
-        <w:tc>
-          <w:tcPr>
-            <w:tcW w:type="dxa" w:w="1715"/>
-          </w:tcPr>
-          <w:p>
-            <w:pPr>
-              <w:pStyle w:val="Compact"/>
-              <w:spacing w:after="20" w:before="20"/>
-              <w:jc w:val="left"/>
-            </w:pPr>
-            <w:r>
-              <w:rPr>
-                <w:sz w:val="18"/>
-              </w:rPr>
-              <w:t xml:space="preserve">1,04</w:t>
-            </w:r>
-          </w:p>
-        </w:tc>
-        <w:tc>
-          <w:tcPr>
-            <w:tcW w:type="dxa" w:w="1715"/>
-          </w:tcPr>
-          <w:p>
-            <w:pPr>
-              <w:pStyle w:val="Compact"/>
-              <w:spacing w:after="20" w:before="20"/>
-              <w:jc w:val="left"/>
-            </w:pPr>
-            <w:r>
-              <w:rPr>
-                <w:sz w:val="18"/>
-              </w:rPr>
-              <w:t xml:space="preserve">0,40</w:t>
-            </w:r>
-          </w:p>
-        </w:tc>
-        <w:tc>
-          <w:tcPr>
-            <w:tcW w:type="dxa" w:w="1715"/>
-          </w:tcPr>
-          <w:p>
-            <w:pPr>
-              <w:pStyle w:val="Compact"/>
-              <w:spacing w:after="20" w:before="20"/>
-              <w:jc w:val="left"/>
-            </w:pPr>
-            <w:r>
-              <w:rPr>
-                <w:sz w:val="18"/>
-              </w:rPr>
-              <w:t xml:space="preserve">1,70</w:t>
-            </w:r>
-          </w:p>
-        </w:tc>
-        <w:tc>
-          <w:tcPr>
-            <w:tcW w:type="dxa" w:w="1715"/>
-          </w:tcPr>
-          <w:p>
-            <w:pPr>
-              <w:pStyle w:val="Compact"/>
-              <w:spacing w:after="20" w:before="20"/>
-              <w:jc w:val="left"/>
-            </w:pPr>
-            <w:r>
-              <w:rPr>
-                <w:sz w:val="18"/>
-              </w:rPr>
-              <w:t xml:space="preserve">0,89</w:t>
-            </w:r>
-          </w:p>
-        </w:tc>
-        <w:tc>
-          <w:tcPr>
-            <w:tcW w:type="dxa" w:w="2788"/>
-          </w:tcPr>
-          <w:p>
-            <w:pPr>
-              <w:pStyle w:val="Compact"/>
-              <w:spacing w:after="20" w:before="20"/>
-              <w:jc w:val="left"/>
-            </w:pPr>
-            <w:r>
-              <w:rPr>
-                <w:sz w:val="18"/>
-              </w:rPr>
-              <w:t xml:space="preserve">0,87</w:t>
             </w:r>
           </w:p>
         </w:tc>
@@ -2570,7 +2570,7 @@
               <w:rPr>
                 <w:sz w:val="18"/>
               </w:rPr>
-              <w:t xml:space="preserve">1,12</w:t>
+              <w:t xml:space="preserve">1,11</w:t>
             </w:r>
           </w:p>
         </w:tc>
@@ -2606,43 +2606,43 @@
               <w:rPr>
                 <w:sz w:val="18"/>
               </w:rPr>
-              <w:t xml:space="preserve">0,78</w:t>
-            </w:r>
-          </w:p>
-        </w:tc>
-        <w:tc>
-          <w:tcPr>
-            <w:tcW w:type="dxa" w:w="1715"/>
-          </w:tcPr>
-          <w:p>
-            <w:pPr>
-              <w:pStyle w:val="Compact"/>
-              <w:spacing w:after="20" w:before="20"/>
-              <w:jc w:val="left"/>
-            </w:pPr>
-            <w:r>
-              <w:rPr>
-                <w:sz w:val="18"/>
-              </w:rPr>
-              <w:t xml:space="preserve">1,31</w:t>
-            </w:r>
-          </w:p>
-        </w:tc>
-        <w:tc>
-          <w:tcPr>
-            <w:tcW w:type="dxa" w:w="1715"/>
-          </w:tcPr>
-          <w:p>
-            <w:pPr>
-              <w:pStyle w:val="Compact"/>
-              <w:spacing w:after="20" w:before="20"/>
-              <w:jc w:val="left"/>
-            </w:pPr>
-            <w:r>
-              <w:rPr>
-                <w:sz w:val="18"/>
-              </w:rPr>
-              <w:t xml:space="preserve">1,35</w:t>
+              <w:t xml:space="preserve">0,77</w:t>
+            </w:r>
+          </w:p>
+        </w:tc>
+        <w:tc>
+          <w:tcPr>
+            <w:tcW w:type="dxa" w:w="1715"/>
+          </w:tcPr>
+          <w:p>
+            <w:pPr>
+              <w:pStyle w:val="Compact"/>
+              <w:spacing w:after="20" w:before="20"/>
+              <w:jc w:val="left"/>
+            </w:pPr>
+            <w:r>
+              <w:rPr>
+                <w:sz w:val="18"/>
+              </w:rPr>
+              <w:t xml:space="preserve">1,30</w:t>
+            </w:r>
+          </w:p>
+        </w:tc>
+        <w:tc>
+          <w:tcPr>
+            <w:tcW w:type="dxa" w:w="1715"/>
+          </w:tcPr>
+          <w:p>
+            <w:pPr>
+              <w:pStyle w:val="Compact"/>
+              <w:spacing w:after="20" w:before="20"/>
+              <w:jc w:val="left"/>
+            </w:pPr>
+            <w:r>
+              <w:rPr>
+                <w:sz w:val="18"/>
+              </w:rPr>
+              <w:t xml:space="preserve">1,34</w:t>
             </w:r>
           </w:p>
         </w:tc>
@@ -2698,43 +2698,25 @@
               <w:rPr>
                 <w:sz w:val="18"/>
               </w:rPr>
-              <w:t xml:space="preserve">2,89</w:t>
-            </w:r>
-          </w:p>
-        </w:tc>
-        <w:tc>
-          <w:tcPr>
-            <w:tcW w:type="dxa" w:w="1715"/>
-          </w:tcPr>
-          <w:p>
-            <w:pPr>
-              <w:pStyle w:val="Compact"/>
-              <w:spacing w:after="20" w:before="20"/>
-              <w:jc w:val="left"/>
-            </w:pPr>
-            <w:r>
-              <w:rPr>
-                <w:sz w:val="18"/>
-              </w:rPr>
-              <w:t xml:space="preserve">0,71</w:t>
-            </w:r>
-          </w:p>
-        </w:tc>
-        <w:tc>
-          <w:tcPr>
-            <w:tcW w:type="dxa" w:w="1715"/>
-          </w:tcPr>
-          <w:p>
-            <w:pPr>
-              <w:pStyle w:val="Compact"/>
-              <w:spacing w:after="20" w:before="20"/>
-              <w:jc w:val="left"/>
-            </w:pPr>
-            <w:r>
-              <w:rPr>
-                <w:sz w:val="18"/>
-              </w:rPr>
-              <w:t xml:space="preserve">0,75</w:t>
+              <w:t xml:space="preserve">2,88</w:t>
+            </w:r>
+          </w:p>
+        </w:tc>
+        <w:tc>
+          <w:tcPr>
+            <w:tcW w:type="dxa" w:w="1715"/>
+          </w:tcPr>
+          <w:p>
+            <w:pPr>
+              <w:pStyle w:val="Compact"/>
+              <w:spacing w:after="20" w:before="20"/>
+              <w:jc w:val="left"/>
+            </w:pPr>
+            <w:r>
+              <w:rPr>
+                <w:sz w:val="18"/>
+              </w:rPr>
+              <w:t xml:space="preserve">0,70</w:t>
             </w:r>
           </w:p>
         </w:tc>
@@ -2753,6 +2735,24 @@
                 <w:sz w:val="18"/>
               </w:rPr>
               <w:t xml:space="preserve">0,74</w:t>
+            </w:r>
+          </w:p>
+        </w:tc>
+        <w:tc>
+          <w:tcPr>
+            <w:tcW w:type="dxa" w:w="1715"/>
+          </w:tcPr>
+          <w:p>
+            <w:pPr>
+              <w:pStyle w:val="Compact"/>
+              <w:spacing w:after="20" w:before="20"/>
+              <w:jc w:val="left"/>
+            </w:pPr>
+            <w:r>
+              <w:rPr>
+                <w:sz w:val="18"/>
+              </w:rPr>
+              <w:t xml:space="preserve">0,73</w:t>
             </w:r>
           </w:p>
         </w:tc>
@@ -2916,7 +2916,7 @@
               <w:rPr>
                 <w:sz w:val="18"/>
               </w:rPr>
-              <w:t xml:space="preserve">1,34</w:t>
+              <w:t xml:space="preserve">1,33</w:t>
             </w:r>
           </w:p>
         </w:tc>
@@ -2990,7 +2990,7 @@
               <w:rPr>
                 <w:sz w:val="18"/>
               </w:rPr>
-              <w:t xml:space="preserve">1,02</w:t>
+              <w:t xml:space="preserve">1,01</w:t>
             </w:r>
           </w:p>
         </w:tc>
@@ -3136,7 +3136,7 @@
               <w:rPr>
                 <w:sz w:val="18"/>
               </w:rPr>
-              <w:t xml:space="preserve">1,57</w:t>
+              <w:t xml:space="preserve">1,56</w:t>
             </w:r>
           </w:p>
         </w:tc>
@@ -3255,7 +3255,7 @@
         <w:pStyle w:val="BodyText"/>
       </w:pPr>
       <w:r>
-        <w:t xml:space="preserve">Điểm cần theo dõi: tháng 11 nặng nhất cả nhóm; Cường cao điểm 12, 2 (Tết ít ngày làm),</w:t>
+        <w:t xml:space="preserve">Điểm cần theo dõi: tháng 11 nặng nhất cả nhóm; Cường cao điểm 12, 2 (Tết ít ngày làm, 2,04),</w:t>
       </w:r>
       <w:r>
         <w:t xml:space="preserve"> </w:t>
@@ -3949,7 +3949,26 @@
               <w:rPr>
                 <w:sz w:val="18"/>
               </w:rPr>
-              <w:t xml:space="preserve">Chỉ đến 3/2027; chưa có ngày lễ, Tết</w:t>
+              <w:t xml:space="preserve">Chỉ đến 3/2027; ngày lễ, Tết lấy theo lịch nghỉ công ty quản lý báo 28/10/2026 (ghi trong</w:t>
+            </w:r>
+            <w:r>
+              <w:rPr>
+                <w:sz w:val="18"/>
+              </w:rPr>
+              <w:t xml:space="preserve"> </w:t>
+            </w:r>
+            <w:r>
+              <w:rPr>
+                <w:rStyle w:val="VerbatimChar"/>
+                <w:sz w:val="18"/>
+              </w:rPr>
+              <w:t xml:space="preserve">lich_lam_viec.py</w:t>
+            </w:r>
+            <w:r>
+              <w:rPr>
+                <w:sz w:val="18"/>
+              </w:rPr>
+              <w:t xml:space="preserve">)</w:t>
             </w:r>
           </w:p>
         </w:tc>
@@ -4143,7 +4162,7 @@
         <w:t xml:space="preserve">lich_lam_viec.py</w:t>
       </w:r>
       <w:r>
-        <w:t xml:space="preserve">: thứ 2–7, nghỉ thứ 7 theo nhóm, trừ lễ;</w:t>
+        <w:t xml:space="preserve">: thứ 2–7, nghỉ thứ 7 theo nhóm, trừ lễ; lễ theo lịch công ty: 24/11/2026, 1/1/2027,</w:t>
       </w:r>
       <w:r>
         <w:t xml:space="preserve"> </w:t>
@@ -4153,10 +4172,10 @@
           <w:bCs/>
           <w:b/>
         </w:rPr>
-        <w:t xml:space="preserve">Tết 2027 tạm 4–12/2, Giỗ Tổ tạm 16/4 – giả định</w:t>
-      </w:r>
-      <w:r>
-        <w:t xml:space="preserve">) × giờ/ngày; mốc 1,0 = trung bình 1 ngày công cả 12 tháng.</w:t>
+        <w:t xml:space="preserve">Tết dự kiến 4–14/2/2027</w:t>
+      </w:r>
+      <w:r>
+        <w:t xml:space="preserve">, 30/4–1/5/2027; Giỗ Tổ 16/4 và Quốc khánh 2–3/9/2027 tạm theo luật) × giờ/ngày; mốc 1,0 = trung bình 1 ngày công cả 12 tháng.</w:t>
       </w:r>
     </w:p>
     <w:p>
@@ -4706,10 +4725,13 @@
           <w:bCs/>
           <w:b/>
         </w:rPr>
-        <w:t xml:space="preserve">Lịch Tết 2027 và ngày lễ của công ty</w:t>
-      </w:r>
-      <w:r>
-        <w:t xml:space="preserve">, lịch nghỉ thứ 7 sau 3/2027 (đang giả định).</w:t>
+        <w:t xml:space="preserve">Lịch Tết 2027 chính thức</w:t>
+      </w:r>
+      <w:r>
+        <w:t xml:space="preserve"> </w:t>
+      </w:r>
+      <w:r>
+        <w:t xml:space="preserve">(đang tính theo dự kiến 4–14/2), ngày nghỉ Giỗ Tổ và Quốc khánh 2027, lịch nghỉ thứ 7 sau 3/2027 (đang giả định).</w:t>
       </w:r>
       <w:r>
         <w:t xml:space="preserve"> </w:t>

</xml_diff>